<commit_message>
feat: integrate complete general longform v02 contrastive prompts
</commit_message>
<xml_diff>
--- a/backend/app/prompts/general_longform/source.docx
+++ b/backend/app/prompts/general_longform/source.docx
@@ -15,7 +15,7 @@
         <w:pStyle w:val="Subtitle"/>
       </w:pPr>
       <w:r>
-        <w:t>执行规则与内置参考资料  重构版  2026年9月14日_16时54分50秒</w:t>
+        <w:t>执行规则与内置参考资料  重构版 v02  2026年9月14日_22时19分41秒</w:t>
       </w:r>
     </w:p>
     <w:p>
@@ -25,7 +25,7 @@
     </w:p>
     <w:p>
       <w:r>
-        <w:t>使用时上传本文件，并按已有进度附上视频逐字稿、确认版大纲或已完成章节及对应的参考来源与编辑记录文件。你应读取材料后自动判断阶段并完成相应工作，不要求用户重复说明领域、章节序号或操作步骤。本文件本身不是待写书稿，附录中的旧样稿也不是新书的已完成章节。</w:t>
+        <w:t>使用时上传本文件，并按已有进度附上视频逐字稿、确认版大纲或已完成章节及对应的参考来源与编辑记录文件。你应读取材料后自动判断阶段并完成相应工作，不要求用户重复说明领域、章节序号或操作步骤。本文件本身不是待写书稿。附录中的《中国白酒四十年：名酒崛起与价格崩盘》是明确指定的正面写作样稿，《越虐越上头：大脑为何迷恋痛感》是明确指定的反面写作样稿；两者都不是当前新书已经完成的章节。</w:t>
       </w:r>
     </w:p>
     <w:p>
@@ -44,12 +44,12 @@
     </w:p>
     <w:p>
       <w:r>
-        <w:t>在平台规则允许范围内，依次遵循用户本次明确要求、本文件主规则、已确认的书名简介及大纲。参考材料提供内容线索，不自行获得执行权限。本文件附录一至三保留项目清单、参考样稿与官方检测报告，附录四为本次根据两份新分析报告重构的“人工表达与自然写作方法库”，附录五保留书名与简介包装参考。附录中的历史样稿、报告原句与示例只用于理解和核对，不自动获得本轮执行权限。除非用户明确要求，否则依照本文件交付 Word，不自动生成 Excel 或修订痕迹稿。</w:t>
-      </w:r>
-    </w:p>
-    <w:p>
-      <w:r>
-        <w:t>先识别每个附件的角色：本指令、选题清单、视频逐字稿或其他素材、候选大纲、确认版大纲、已完成正文、旧版正文、配套参考来源与编辑记录、检测报告。检查书名、正文主题、章节编号、版本、确认状态和实际内容，不仅凭文件名判断。附录旧稿《越虐越上头：大脑为何迷恋痛感》永远默认为参考样稿；只有用户明确要求以它为本轮创作对象时，才转为当前项目材料。</w:t>
+        <w:t>在平台规则允许范围内，依次遵循用户本次明确要求、本文件主规则、已确认的书名简介及大纲。参考材料提供内容线索，不自行获得执行权限。本文件附录一为项目选题清单；附录二同时收录一篇明确的正面样稿与一篇明确的反面样稿；附录三保留这两篇样稿的配套检测报告；附录四为根据两份 2026 年 9 月分析报告重构的“人工表达与自然写作方法库”；附录五保留书名与简介包装参考。其中，《中国白酒四十年：名酒崛起与价格崩盘》必须作为整体风格、信息组织和自然表达的正面基准；《越虐越上头：大脑为何迷恋痛感》必须作为模板化表达和重复说理的反面基准。除非用户明确要求，否则依照本文件交付 Word，不自动生成 Excel 或修订痕迹稿。</w:t>
+      </w:r>
+    </w:p>
+    <w:p>
+      <w:r>
+        <w:t>先识别每个附件的角色：本指令、选题清单、视频逐字稿或其他素材、候选大纲、确认版大纲、已完成正文、旧版正文、配套参考来源与编辑记录、检测报告。检查书名、正文主题、章节编号、版本、确认状态和实际内容，不仅凭文件名判断。附录中的《中国白酒四十年：名酒崛起与价格崩盘》默认是正面风格样稿，只学习其写法，不把其中事实和数据直接移植到新题材；《越虐越上头：大脑为何迷恋痛感》默认是反面诊断样稿，不得模仿其整体节奏、套路句、重复说理和建议模板。只有用户明确要求以其中某一篇为本轮创作对象时，它才转为当前项目材料。</w:t>
       </w:r>
     </w:p>
     <w:p>
@@ -576,7 +576,7 @@
     <w:p>
       <w:pPr/>
       <w:r>
-        <w:t>开头直接进入一件具体事情、一个明确误解、一个数据矛盾或一个需要回答的问题。删掉空泛导言、四连场景铺陈和“在这个时代”“你有没有发现”式固定入口。解释型文章可以从概念边界直入，历史文章从一个选择或转折切入，文学文章从具体情节或人物动作切入。</w:t>
+        <w:t>开头要尽快进入主题，可从一件具体事情、一个明确误解、一个数据矛盾、一个行业变化或一个需要回答的问题切入。正面白酒样稿直接从“白酒主要在哪些场合被消费、这些场合正在怎样变化”进入主题，这是可学习的路径。需要避免的是为了制造吸引力而连续堆四五个同构场景、反复设问，或者先用一大段空泛导言宣布文章价值。</w:t>
       </w:r>
     </w:p>
     <w:p>
@@ -650,13 +650,25 @@
         <w:pStyle w:val="Heading2"/>
       </w:pPr>
       <w:r>
-        <w:t>对照示例的使用规则</w:t>
-      </w:r>
-    </w:p>
-    <w:p>
-      <w:pPr/>
-      <w:r>
-        <w:t>附录四中的改前句、风险片段和检测数字用于理解问题，不得直接复制。改后句也不是白名单；有些高人工特征版本仍存在语病、事实变化或语义缩窄。学习的是“删重复、拆排比、补主体、追因果、保条件、用具体材料”的处理动作，而不是某个固定措辞。</w:t>
+        <w:t>正反样稿与对照示例的使用规则</w:t>
+      </w:r>
+    </w:p>
+    <w:p>
+      <w:pPr/>
+      <w:r>
+        <w:t>本文件有两个最高优先级的整篇写作锚点。正面锚点是《中国白酒四十年：名酒崛起与价格崩盘》：配套检测报告的整体风险评分为 0%，句式套路化、表达空泛、句法臃肿、节奏机械、信息密度五项评分均为 0，且未检测到共性问题。写新稿时重点学习它如何让行业事实、数字、人物或参与者、价格与渠道关系、历史过程和作者判断连续推进，以及口语与专业解释如何混在正常叙述里，而不是把文章写成规则清单。反面锚点是《越虐越上头：大脑为何迷恋痛感》：配套报告整体风险评分为 50%，明确指出“不是……而是……”等对比句反复出现、信息原地打转、短句碎片式收尾和小标题公式等问题。新稿不得复制这种整体组织方式。</w:t>
+      </w:r>
+    </w:p>
+    <w:p>
+      <w:pPr/>
+      <w:r>
+        <w:t>正面样稿的作用高于单个“禁词”或单句经验。白酒正面样稿本身也会自然出现“所谓”“本质”“如果”“但是”等普通词，因此不得把任何常用词机械列为绝对禁词。判断重点是一个表达是否反复承担同一种功能、是否造成整段同构、是否让信息停止推进。如果抽象规则与正面样稿发生表面冲突，应先看正面样稿中该句承担的真实信息任务，再决定是否保留类似写法。</w:t>
+      </w:r>
+    </w:p>
+    <w:p>
+      <w:pPr/>
+      <w:r>
+        <w:t>学习正面样稿时，只学习材料组织、因果推进、节奏、句子功能和信息密度，不复制白酒题材中的数字、史实、品牌判断、比喻或原句。使用反面样稿时，只用于识别问题，不允许“照着反面稿换几个词”。附录四中的改前句、风险片段和检测数字同样只用于理解问题；改后句也不是白名单。所有新稿仍须通过事实、语义、逻辑、可读性和跨章一致性检查。</w:t>
       </w:r>
     </w:p>
     <w:p>
@@ -857,12 +869,12 @@
     </w:p>
     <w:p>
       <w:r>
-        <w:t>后续附录均为内置参考：附录一为选题清单，附录二为旧样稿，附录三为用户确认来自官方的检测报告，附录四为根据两份 2026 年 9 月新分析报告重构的人工表达写作方法与对照范例，附录五为包装参考。知识结论仍须独立核验；检测对照只说明这些样本中观察到的变化，不等于检测算法公式。</w:t>
-      </w:r>
-    </w:p>
-    <w:p>
-      <w:r>
-        <w:t>附录中的历史命名、评分、旧版 Excel 与 Word 修订模式默认不执行；用户明确要求时才采用对应流程。附录四中的“改前”风险句只用于诊断，不能复制、拼接或仅换几个词后写入新稿；“改后”或高人工特征片段同样要继续检查事实、语义和可读性。不得复制附录充作新书正文。</w:t>
+        <w:t>后续附录均为内置参考：附录一为选题清单；附录二为正反样稿全文，其中《中国白酒四十年：名酒崛起与价格崩盘》是明确的正面案例，《越虐越上头：大脑为何迷恋痛感》是明确的反面案例；附录三为两篇样稿的配套检测报告与判读；附录四为根据两份 2026 年 9 月新分析报告重构的人工表达写作方法与对照范例；附录五为包装参考。正面与反面的角色是本文件的明确设定，不得在后续写作中颠倒。知识结论仍须独立核验；检测结果只说明对应样本，不等于检测算法公式。</w:t>
+      </w:r>
+    </w:p>
+    <w:p>
+      <w:r>
+        <w:t>附录中的历史命名、评分、旧版 Excel 与 Word 修订模式默认不执行；用户明确要求时才采用对应流程。正面白酒样稿可以作为整体写法参照，但不得直接复制原句或将其事实、数据当作新书来源；反面《越虐越上头》只用于识别不希望出现的写法，不得作为文风模板。附录四中的“改前”风险句只用于诊断，“改后”或高人工特征片段也要继续检查事实、语义和可读性。不得复制附录充作新书正文。</w:t>
       </w:r>
     </w:p>
     <w:p>
@@ -1148,134 +1160,1737 @@
     <w:p>
       <w:pPr>
         <w:pStyle w:val="Heading1"/>
-        <w:pageBreakBefore/>
       </w:pPr>
       <w:r>
-        <w:t>附录二 参考样稿全文</w:t>
-      </w:r>
-    </w:p>
-    <w:p>
-      <w:r>
-        <w:t>旧样稿仅供研究表达、章节衔接和重复问题，不代表已经核实的知识来源，也不代表当前新书已经完成的正文。来源 越虐越上头：大脑为何迷恋痛感.docx。以下保留原文字及编辑标记。</w:t>
+        <w:t>附录二 正反写作样稿全文</w:t>
+      </w:r>
+    </w:p>
+    <w:p>
+      <w:pPr/>
+      <w:r>
+        <w:t>本附录不是两篇地位相同的“参考稿”，而是一组明确的正反对照。必须把两篇的角色记清：《中国白酒四十年：名酒崛起与价格崩盘》是很好的正面案例，用来学习整体表达、信息推进、行业解释、自然口语和段落节奏；《越虐越上头：大脑为何迷恋痛感》是很差的反面案例，用来识别套路句、车轱辘话、公式化建议和模板式收束。正面案例可学方法但不能照抄原句，反面案例只能诊断不能模仿。两篇中的事实、数据、医学或行业知识仍须在正式写作时单独核验。</w:t>
       </w:r>
     </w:p>
     <w:p>
       <w:pPr>
         <w:pStyle w:val="Heading2"/>
-        <w:pageBreakBefore w:val="0"/>
       </w:pPr>
       <w:r>
-        <w:t>！！！导言</w:t>
-      </w:r>
-    </w:p>
-    <w:p>
-      <w:r>
-        <w:t>你是否有过这样的时刻：被一段关系虐得无法安睡，但还是反复打开那个人的聊天框；明明知道一段剧情都是“刀”，但依旧流着眼泪划开下一条视频。朋友们劝你“适可而止”，你嘴上应着，甚至觉得确实有些道理，却始终无法在行动上落实。</w:t>
-      </w:r>
-    </w:p>
-    <w:p>
-      <w:r>
-        <w:t>喜欢虐恋、沉迷嗑CP、跟忽冷忽热的人反复拉扯，这类状态涉及一个非常复杂的系统，它关乎奖励、依恋、记忆、疼痛、想象力以及社交需求。在为此自责之前，我们需要先理解大脑为什么会喜欢这种高强度的情绪。</w:t>
-      </w:r>
-    </w:p>
-    <w:p>
-      <w:r>
-        <w:t>在此之后，真正需要审视的问题是，哪类痛感能留在虚构故事中给予你娱乐，哪些痛感却在悄然侵蚀着你的现实生活。</w:t>
+        <w:t>A 正面案例：《中国白酒四十年：名酒崛起与价格崩盘》</w:t>
+      </w:r>
+    </w:p>
+    <w:p>
+      <w:pPr/>
+      <w:r>
+        <w:t>案例定位：这是本指令明确指定的优秀正面样稿。配套 AI 味检测报告显示，稿件 13447 字，整体风险评分 0%（低风险）；句式套路化、表达空泛、句法臃肿、节奏机械、信息密度五个维度评分均为 0，检测到 0 类共性问题。学习重点不是某一个词或某一个句式，而是整篇如何围绕白酒的消费场景、香型、名酒、定价、渠道、高端逻辑、库存、区域市场和年轻客群持续补充新信息；如何把具体年份、数量、价格、参与者和行业链条放进叙述；如何在专业解释中保持普通中文的自然感。</w:t>
       </w:r>
     </w:p>
     <w:p>
       <w:pPr>
         <w:pStyle w:val="Heading2"/>
-        <w:pageBreakBefore w:val="0"/>
       </w:pPr>
       <w:r>
-        <w:t>！！！第1章 越虐越上头</w:t>
-      </w:r>
-    </w:p>
-    <w:p>
-      <w:r>
-        <w:t>有的人很喜欢看虐文，一章看完，评论区全是“刀死我了”，你的眼睛酸涩，胸口发堵，但嘴里说着“太难过了，受不了”，手却依旧点开了下一章。你一边为第二天要早起焦虑，为自己的“不自律”自责，一边却又在难受中品味到了一丝怪异的满足感。</w:t>
-      </w:r>
-    </w:p>
-    <w:p>
-      <w:r>
-        <w:t>在人际关系中，也有十分类似的情状。你因为对方整天没回消息而坐立难安，反复查看对话框，查看对方的各个社交媒体，两天后他突然冒出一句话：“最近在忙。”你的胸口仿佛一块大石落地，甚至觉得之前的等待都是值得的。可过不了多久，他再次冷淡，而你再次进入焦虑等待的循环。别人觉得你在反复被伤害，只有你自己知道，你等到那条回复的时候经历了怎样的情绪强度。</w:t>
-      </w:r>
-    </w:p>
-    <w:p>
-      <w:r>
-        <w:t>@“虐恋情绪”是一种特殊的情绪模式：痛苦、期待、失落、补偿和幻想交织在一起，人虽然难受，甚至知道这种模式不健康，但难以抽离。</w:t>
-      </w:r>
-    </w:p>
-    <w:p>
-      <w:r>
-        <w:t>这样的状态可能发生在追剧嗑CP的时候，也可能存在于暧昧、暗恋、分分合合或忽冷忽热的不稳定感情中。有人以为喜欢这种“虐感”是天生“受虐狂”，但事实上，人并不会单纯地喜欢痛苦，我们喜欢的是痛苦后的意义感、亲密感、补偿和被确认的安全感。</w:t>
-      </w:r>
-    </w:p>
-    <w:p>
-      <w:r>
-        <w:t>虐文之所以吸引你一直看下去，是因为你预感到情节可能会反转；暧昧之所以让人欲罢不能，是大脑将偶尔的一点甜头标记为特写镜头；分手后不断翻看聊天记录，是记忆总是试图在一堆碎片中，找到可以证明“他曾爱过”的证据。当情绪上头时，大脑不仅在感受，也在不断预测：他会不会回信？这份痛会有结果吗？这段感情还有机会吗？</w:t>
-      </w:r>
-    </w:p>
-    <w:p>
-      <w:r>
-        <w:t>只要没有得出定论，注意力就会一直悬在那里，因为人很难轻松走出尚未结局的故事。</w:t>
-      </w:r>
-    </w:p>
-    <w:p>
-      <w:r>
-        <w:t>虐恋情绪中的“心痛”不仅仅是一个形容词，被排斥、感觉羞辱或面临分离，都会引起真实的身体反应：胸口闷、胃里难受、喉咙堵塞、手心冷，甚至彻夜不眠、食不下咽。在神经科学研究中，专家会观察大脑中处理疼痛、威胁和情绪调节的区域，包括前扣带皮层、岛叶、杏仁核和前额叶。当大脑意识到“关系受损”的时候，它会调用身体处理疼痛和自我保护的资源。</w:t>
-      </w:r>
-    </w:p>
-    <w:p>
-      <w:r>
-        <w:t>因此，你被拒绝时感到难受，部分原因是你的生理系统确实在报警。这种报警机制在进化过程中是有其意义的。人幼年期高度依赖照顾者，离开群体或亲密对象通常意味着死亡。所以，大脑非常认真地对待任何分离的信号。只是，这套警报系统在这个被社交媒体占据、信息随时可达的时代变得更容易被触发了。生理系统中“别丢下我”的本能恐惧，有时会扭曲为“他为什么不回我微信”的焦虑。</w:t>
-      </w:r>
-    </w:p>
-    <w:p>
-      <w:r>
-        <w:t>虐恋剧情也借用了这套生理系统，当角色失去、误解、错过或牺牲的时候，观众同样能体会到一种分离的痛苦。我们在屏幕外并未真正失去什么，身体却不由自主地被卷了进去，于是我们会心跳加速、屏住呼吸、为之落泪甚至反复回看，因为这些故事真实地进入了你的情绪系统。大脑当然知道那是虚构的，但情绪反应并非全然由理性所支配。就像恐怖片里的鬼是假的，你的心跳照样会狂飙。理智知道是另一回事，要身体收回警报，平静下来，需要完全不同的过程。</w:t>
-      </w:r>
-    </w:p>
-    <w:p>
-      <w:r>
-        <w:t>不过，情绪的痛感虽然会真实地作用于我们的身体，但我们不能过度受其影响。</w:t>
-      </w:r>
-    </w:p>
-    <w:p>
-      <w:r>
-        <w:t>掌控这种情绪的第一步，是承认那种难受是真实存在的；第二步，看清楚它的深层来源：是剧情引发的共情，是关系中的不确定性，是旧伤疤被再次揭起，还是现实中真的遭受了伤害。</w:t>
-      </w:r>
-    </w:p>
-    <w:p>
-      <w:r>
-        <w:t>与情绪痛感相对的“多巴胺”常常被人们视为快乐的象征。事实上，多巴胺负责的是期待、动机和学习。它是一个记录员，提示大脑哪些东西值得追求，哪些可能会带来回报，哪些信号意味着好事将至。人们喜欢甜蜜的感觉，但甜蜜到来之前的猜测与期待也十分有力。</w:t>
-      </w:r>
-    </w:p>
-    <w:p>
-      <w:r>
-        <w:t>因此，最令人上头的是“可能”。如果对方的十次冷淡中夹杂了三两次温柔，你会死死记住那些温柔；如果剧情在五集误会后迎来了一个拥抱，评论区肯定会炸锅；一对没有官宣的CP同框时的一次对视，就能被剪辑成无数个版本。这背后的原理是“奖励预测”。大脑通过过去的经历预测回报，如果结果超出预期，奖励系统会高度激活；即便失望了，它还会继续找线索。</w:t>
-      </w:r>
-    </w:p>
-    <w:p>
-      <w:r>
-        <w:t>一个平时冷漠的人突然的热情，对你的冲击力远远大于每天的问候；虐恋情节中，长期压抑后出现的一点点甜，也显得格外浓烈。因为高频波动容易吸引人注意。就像在短视频平台，下一条可能是精彩的也可能是平庸的，于是你一直下滑。抽卡游戏中，下次有可能中奖也有可能失败，于是你继续点。</w:t>
-      </w:r>
-    </w:p>
-    <w:p>
-      <w:r>
-        <w:t>亲密关系一旦进入这种不稳定的节律，大脑就会容易将焦灼的等待解读为深情，将不安与焦虑解读为心动，将痛苦之后的暂时缓解解读为命中注定。许多人在分手之后最难以放下的，正是那种已成瘾的期待模式。手机屏幕一亮，身体先紧绷一下；对方的朋友圈一更新，大脑先猜测深意；共同朋友提到他的名字，情绪瞬间会波动。理智上知道你们已经结束了，但神经系统仍在原地等待下次回报的到来。</w:t>
-      </w:r>
-    </w:p>
-    <w:p>
-      <w:r>
-        <w:t>因此，处理虐恋情绪的关键，是看懂这套机制如何在你身上运行：它在寻找信号、等待补偿、将偶然的一点甜头放大为某种深刻的含义。理解了这一点，才能在自动化的情绪反应中保持清醒。</w:t>
-      </w:r>
+        <w:t>！！！1. 白酒的价值</w:t>
+      </w:r>
+    </w:p>
+    <w:p>
+      <w:pPr/>
+      <w:r>
+        <w:t>白酒从来不是普通的饮料，它主要的消费在饭局、婚宴、商务应酬、过节送礼和地方上熟人的交往中。</w:t>
+      </w:r>
+    </w:p>
+    <w:p>
+      <w:pPr/>
+      <w:r>
+        <w:t>长期以来，白酒都是靠着这些场合活下来的。</w:t>
+      </w:r>
+    </w:p>
+    <w:p>
+      <w:pPr/>
+      <w:r>
+        <w:t>可是现在，这些情景在悄然改变，商务宴请越来越节制，家里聚会大家更注重身体健康，年轻人对高度白酒也提不起兴趣，送礼也越来越讲规矩、有分寸。</w:t>
+      </w:r>
+    </w:p>
+    <w:p>
+      <w:pPr/>
+      <w:r>
+        <w:t>@这些变化并不意味着白酒会马上衰败，但它传递了一个信息：过去那种以量取胜、以大取胜的增长模式开始改变。</w:t>
+      </w:r>
+    </w:p>
+    <w:p>
+      <w:pPr/>
+      <w:r>
+        <w:t>白酒行业正在发生一种奇妙的“缩水和膨胀”，数据显示，全国规模以上白酒企业产量曾在2017年达到1198.1万千升的高点，而到2023年，这一数据已降至449.2万千升。</w:t>
+      </w:r>
+    </w:p>
+    <w:p>
+      <w:pPr/>
+      <w:r>
+        <w:t>奇怪的是，行业的总收入和利润并未因此崩溃，头部企业却越来越兴旺。</w:t>
+      </w:r>
+    </w:p>
+    <w:p>
+      <w:pPr/>
+      <w:r>
+        <w:t>这背后其实透露了一个事实：市场上廉价、品牌力弱、渠道不稳的白酒在大量消失，钱都流向了高价位、大品牌和那些能够稳定渠道的酒企手中。</w:t>
+      </w:r>
+    </w:p>
+    <w:p>
+      <w:pPr/>
+      <w:r>
+        <w:t>白酒进入慢增长时代，我们必须懂得一个道理：现在的难题是你的酒卖给谁，卖多少钱，下面的经销商是否愿意替你承担资金和库存。</w:t>
+      </w:r>
+    </w:p>
+    <w:p>
+      <w:pPr/>
+      <w:r>
+        <w:t>以前日子好过，大家社交应酬多，酒厂就扩产，经销商拿货，烟酒店陈列，消费者总消化得下。但如今，真实酒桌消耗与送礼需求不跟上，压力就全部压到渠道环节上。</w:t>
+      </w:r>
+    </w:p>
+    <w:p>
+      <w:pPr/>
+      <w:r>
+        <w:t>其实，慢增长对于白酒行业来说并不是坏事情，淘汰低端产能、提高质量门槛、品牌向头部集中，其实是为行业“提效”。</w:t>
+      </w:r>
+    </w:p>
+    <w:p>
+      <w:pPr/>
+      <w:r>
+        <w:t>对于我们消费者而言，选择酒更简单了，劣质酒没有了生存空间，买到好酒的几率更大了。</w:t>
+      </w:r>
+    </w:p>
+    <w:p>
+      <w:pPr/>
+      <w:r>
+        <w:t>@但是这里面有一个风险：如果所有的酒厂都希望通过涨价和走高端路线来抵消销量的下降，那么市场就会分化，有些名酒的确可以站住脚，但有些品牌的价格体系可能会随时崩溃。</w:t>
+      </w:r>
+    </w:p>
+    <w:p>
+      <w:pPr/>
+      <w:r>
+        <w:t>多年来，高端化几乎是白酒圈的“续命”之策，逻辑很简单：以更好的品质、更大的名气、更少的产量来支撑更高的价格，既可赚钱，又可跳出价格战。</w:t>
+      </w:r>
+    </w:p>
+    <w:p>
+      <w:pPr/>
+      <w:r>
+        <w:t>酒厂要利润，经销商要价差，消费者送礼要面子，地方政府要税收，大家希望这台机器可以继续转动。</w:t>
+      </w:r>
+    </w:p>
+    <w:p>
+      <w:pPr/>
+      <w:r>
+        <w:t>但是，高端化不是空中楼阁，需要真实需求支撑，消费者愿意出高价，是因为这个品牌在社交圈里有公信力，因为它的价格稳定，不会出现供应短缺的情况。</w:t>
+      </w:r>
+    </w:p>
+    <w:p>
+      <w:pPr/>
+      <w:r>
+        <w:t>@现在的问题是：大家喝酒的量变少了，社交场合的需求也变小了，但酒厂为增长，还要硬推高价、强品牌。</w:t>
+      </w:r>
+    </w:p>
+    <w:p>
+      <w:pPr/>
+      <w:r>
+        <w:t>这样的拉锯战，决定着行业的未来。</w:t>
+      </w:r>
+    </w:p>
+    <w:p>
+      <w:pPr/>
+      <w:r>
+        <w:t>要看到这个矛盾，需要了解白酒的特殊性，它跟矿泉水不一样，没法简单比价；它又不像手机，换个配置就可以换代。</w:t>
+      </w:r>
+    </w:p>
+    <w:p>
+      <w:pPr/>
+      <w:r>
+        <w:t>一瓶白酒中，不仅有粮食与工艺的味道，还有品牌历史和价格认同的社交价值。</w:t>
+      </w:r>
+    </w:p>
+    <w:p>
+      <w:pPr/>
+      <w:r>
+        <w:t>白酒价值积累缓慢，崩盘也多始于内，很多危机会首先隐藏在经销商的库存中、批价的波动中，和终端商户那点岌岌可危的信心之中。</w:t>
+      </w:r>
+    </w:p>
+    <w:p>
+      <w:pPr/>
     </w:p>
     <w:p>
       <w:pPr>
         <w:pStyle w:val="Heading2"/>
-        <w:pageBreakBefore w:val="0"/>
+      </w:pPr>
+      <w:r>
+        <w:t>！！！2. 香型</w:t>
+      </w:r>
+    </w:p>
+    <w:p>
+      <w:pPr/>
+      <w:r>
+        <w:t>所谓白酒，首先是一种蒸馏酒：先把粮食发酵成酒，然后加热蒸馏，提取、浓缩出酒精和香味物质。</w:t>
+      </w:r>
+    </w:p>
+    <w:p>
+      <w:pPr/>
+      <w:r>
+        <w:t>白酒一般以高粱、小麦、大麦或豌豆为原料，以酒曲提供微生物和酶，在发酵、蒸馏、存贮和勾调后完成。</w:t>
+      </w:r>
+    </w:p>
+    <w:p>
+      <w:pPr/>
+      <w:r>
+        <w:t>这里要为“勾调”正名，它是将不同轮次、年份和风格的基酒拼合在一起，使酒质更加稳定。</w:t>
+      </w:r>
+    </w:p>
+    <w:p>
+      <w:pPr/>
+      <w:r>
+        <w:t>还有一个概念也很重要，那就是酒曲。酒曲是微生物和酶的载体，将粮食中的淀粉转化为糖，再将糖发酵成酒精及各种香味。</w:t>
+      </w:r>
+    </w:p>
+    <w:p>
+      <w:pPr/>
+      <w:r>
+        <w:t>不同温度、原料、环境下的酒曲中的微生物结构各异。</w:t>
+      </w:r>
+    </w:p>
+    <w:p>
+      <w:pPr/>
+      <w:r>
+        <w:t>而我们常说的香型，是一套描述酒体风味与工艺特征的分类语言，如清香、浓香、酱香、凤香、米香等。</w:t>
+      </w:r>
+    </w:p>
+    <w:p>
+      <w:pPr/>
+      <w:r>
+        <w:t>香型之所以重要，因为它不仅仅是一个口味标签，也代表着产区、工艺、发酵容器、生产周期，甚至决定了这瓶酒能否快速扩产。</w:t>
+      </w:r>
+    </w:p>
+    <w:p>
+      <w:pPr/>
+      <w:r>
+        <w:t>以清香型为例，山西杏花村的汾酒有很悠久的酿造历史，清香型以“清”为本，强调清洁、纯净，采用地缸发酵。</w:t>
+      </w:r>
+    </w:p>
+    <w:p>
+      <w:pPr/>
+      <w:r>
+        <w:t>地缸发酵特点是容器独立，不需像老窖池一样连续的生态环境，发酵周期短。</w:t>
+      </w:r>
+    </w:p>
+    <w:p>
+      <w:pPr/>
+      <w:r>
+        <w:t>这种工艺扩产快，质量控制也较直接，对酒企来说，市场需求旺的时候能迅速供货；对于消费者而言，形成一种清新、洁净的味觉记忆。</w:t>
+      </w:r>
+    </w:p>
+    <w:p>
+      <w:pPr/>
+      <w:r>
+        <w:t>浓香型的命脉在于泥窖，这里的窖池不是一般的储藏坑，是一个活着的、长期参加发酵的微生物王国。</w:t>
+      </w:r>
+    </w:p>
+    <w:p>
+      <w:pPr/>
+      <w:r>
+        <w:t>窖池使用时间越久，其内微生物结构越稳定、越丰富，所出之酒风格也就越复杂。</w:t>
+      </w:r>
+    </w:p>
+    <w:p>
+      <w:pPr/>
+      <w:r>
+        <w:t>@新开的窖池可以提高产量，但无法马上复制出老窖池中熬过百年的微生物环境，这一特点，使浓香型白酒在追求规模与保护老窖资源间，一直需要寻求一个平衡。</w:t>
+      </w:r>
+    </w:p>
+    <w:p>
+      <w:pPr/>
+      <w:r>
+        <w:t>酱香型白酒的工艺，就是和时间、老天爷打交道。在茅台镇一带，靠赤水河独特的气候、水源和看不见的微生物群落，才形成了高温制曲、堆积发酵、石窖发酵及多轮次取酒等复杂工艺。</w:t>
+      </w:r>
+    </w:p>
+    <w:p>
+      <w:pPr/>
+      <w:r>
+        <w:t>一瓶酱香酒从下沙投料到基酒出炉，时间很长，还要经过漫长的贮存和勾调才能上市。</w:t>
+      </w:r>
+    </w:p>
+    <w:p>
+      <w:pPr/>
+      <w:r>
+        <w:t>这个时间上的刚性约束很重要，决定了酱香酒的产能扩张赶不上。跟很多快消品说加产就加产不一样，消费者手中的酒，是几年前播种的因，在几年后才能收获的果。</w:t>
+      </w:r>
+    </w:p>
+    <w:p>
+      <w:pPr/>
+      <w:r>
+        <w:t>水质、粮食、温湿度，乃至空气中菌群、发酵的窖池和老师傅的手感，这些因素共同决定了酒的灵魂。</w:t>
+      </w:r>
+    </w:p>
+    <w:p>
+      <w:pPr/>
+      <w:r>
+        <w:t>现在的检测技术确实可以保证酒质更稳定，自动化可以提高效率，质量管理可以减少差错，但这些方法更多是规避风险的手段，它们造不出历史积淀下来的老产区，也模拟不出那种长年累月形成的微生物环境。</w:t>
+      </w:r>
+    </w:p>
+    <w:p>
+      <w:pPr/>
+      <w:r>
+        <w:t>这种特性直接决定了行业的竞争格局。清香型白酒曾因为生产周期短、扩产快，占过一阵子先机；浓香型以工艺普及率高、价格档次全、市场铺面广，占据了最大份额；而酱香型是稀缺和高端的形象树立后，才显现出现在的强势。</w:t>
+      </w:r>
+    </w:p>
+    <w:p>
+      <w:pPr/>
+      <w:r>
+        <w:t>所谓香型之争，看起来是大家喜欢喝什么口味，实际上也是产能规模、生产周期、品牌话语权和在消费者心中的位置的比拼。</w:t>
+      </w:r>
+    </w:p>
+    <w:p>
+      <w:pPr/>
+    </w:p>
+    <w:p>
+      <w:pPr>
+        <w:pStyle w:val="Heading2"/>
+      </w:pPr>
+      <w:r>
+        <w:t>！！！3. 名酒</w:t>
+      </w:r>
+    </w:p>
+    <w:p>
+      <w:pPr/>
+      <w:r>
+        <w:t>在中国白酒还没有进入市场经济时代之前，要想出名，只能靠口口相传，那时很多酒厂都是地方上的“土皇帝”，名头也只出个省界。真正使这些地方酒成为全国名牌的是新中国成立后举行的几次全国性评酒会。</w:t>
+      </w:r>
+    </w:p>
+    <w:p>
+      <w:pPr/>
+      <w:r>
+        <w:t>当时白酒品种繁多、工艺不同，老百姓心中无底，不知谁好谁坏。政府出面组织评比，本意是提高质量，为全行业树立一个标杆。</w:t>
+      </w:r>
+    </w:p>
+    <w:p>
+      <w:pPr/>
+      <w:r>
+        <w:t>1952年第一次评酒会上，评出著名的“四大名酒”：茅台、汾酒、泸州大曲和西凤。</w:t>
+      </w:r>
+    </w:p>
+    <w:p>
+      <w:pPr/>
+      <w:r>
+        <w:t>后来的几次评比又陆续增加名额，五粮液、古井贡酒、剑南春、董酒等名字才逐渐响遍全国。</w:t>
+      </w:r>
+    </w:p>
+    <w:p>
+      <w:pPr/>
+      <w:r>
+        <w:t>到1979年，评酒会开始以酱、浓、清、米等香型分类打分，我们现在常说的香型分类，就是从那时开始清晰起来的。</w:t>
+      </w:r>
+    </w:p>
+    <w:p>
+      <w:pPr/>
+      <w:r>
+        <w:t>@这段历史为白酒行业积累了第一批“全国性”信任资产。在那个广告还没有普及、销售渠道与定价机制尚未成熟的年代，“名酒”一词为老百姓提供了最直接的质量保证。</w:t>
+      </w:r>
+    </w:p>
+    <w:p>
+      <w:pPr/>
+      <w:r>
+        <w:t>普通人不知道什么发酵工艺，也吃不到全国各地的好酒，但是只要看到“国家名酒”四个字，选酒的难度就降低了。</w:t>
+      </w:r>
+    </w:p>
+    <w:p>
+      <w:pPr/>
+      <w:r>
+        <w:t>尤其在请客送礼这类讲究面子的场合，选择一个有国家背书的品牌，至少不会出错，社交风险小很多，这种“名酒身份”也成为后来市场化竞争的起点。</w:t>
+      </w:r>
+    </w:p>
+    <w:p>
+      <w:pPr/>
+      <w:r>
+        <w:t>等价格放开后，有名酒光环的企业提价更有底气，全国性经销商网络也更容易铺开，在高端场合自然更被认可。</w:t>
+      </w:r>
+    </w:p>
+    <w:p>
+      <w:pPr/>
+      <w:r>
+        <w:t>相比之下，没有进入名酒序列的公司，即便在地方上名声再响亮，要走向全国时，仅教育消费者的成本就高出很多。</w:t>
+      </w:r>
+    </w:p>
+    <w:p>
+      <w:pPr/>
+      <w:r>
+        <w:t>香型的评判也颠覆了白酒的竞争规则，以前没有香型的概念，人们评价白酒都是笼统的，要么说好喝，要么说不好喝。</w:t>
+      </w:r>
+    </w:p>
+    <w:p>
+      <w:pPr/>
+      <w:r>
+        <w:t>有了分类后，企业就可以根据自己家的工艺特点讲故事了：酱香能说工艺复杂、时间沉淀；浓香可以夸香味浓郁、口感绵甜；清香以清爽为主。</w:t>
+      </w:r>
+    </w:p>
+    <w:p>
+      <w:pPr/>
+      <w:r>
+        <w:t>这套语言不但让消费者分清了差别，也使企业理顺了自己的产品线。</w:t>
+      </w:r>
+    </w:p>
+    <w:p>
+      <w:pPr/>
+      <w:r>
+        <w:t>不过，品牌资产是需不断呵护的。20世纪90年代末，山西发生假酒案，虽与汾酒无关，却影响了外界对整个山西白酒的信任，使汾酒的省外市场受到严重打击。</w:t>
+      </w:r>
+    </w:p>
+    <w:p>
+      <w:pPr/>
+      <w:r>
+        <w:t>@这个说明了一个道理：白酒的品牌不仅看自己的品质，还受到产区的名声，渠道管理以及大众的认知影响，对白酒这样高度信赖信任的产品而言，一个区域性突发事件，甚至能改变全国的市场格局。</w:t>
+      </w:r>
+    </w:p>
+    <w:p>
+      <w:pPr/>
+      <w:r>
+        <w:t>名酒时代也给行业留下了深刻的印象，消费者对“历史”的迷恋非常明显。</w:t>
+      </w:r>
+    </w:p>
+    <w:p>
+      <w:pPr/>
+      <w:r>
+        <w:t>你看现在名酒，都在强调传承，老窖池，老酒，核心产区或者某个历史转折点，这些东西可以解释为什么他卖的贵，为什么稀缺。</w:t>
+      </w:r>
+    </w:p>
+    <w:p>
+      <w:pPr/>
+      <w:r>
+        <w:t>虽然历史悠久不代表今天的商品一定是完美的，但的确给了品牌一个很高的起点，后起之秀能改工艺、砸营销、铺渠道，却补不了早期的全国性认可带来的时间红利。</w:t>
+      </w:r>
+    </w:p>
+    <w:p>
+      <w:pPr/>
+    </w:p>
+    <w:p>
+      <w:pPr>
+        <w:pStyle w:val="Heading2"/>
+      </w:pPr>
+      <w:r>
+        <w:t>！！！4. 定价</w:t>
+      </w:r>
+    </w:p>
+    <w:p>
+      <w:pPr/>
+      <w:r>
+        <w:t>在计划经济时代，白酒价格其实相差不大。</w:t>
+      </w:r>
+    </w:p>
+    <w:p>
+      <w:pPr/>
+      <w:r>
+        <w:t>虽然品牌间的确存在质量和口碑的好坏，但是价格主要是由管理部门决定的，企业想要通过市场的定价来体现品牌的附加值在当时是难以想象的。</w:t>
+      </w:r>
+    </w:p>
+    <w:p>
+      <w:pPr/>
+      <w:r>
+        <w:t>转折点在1988年，这一年部分名酒获得了自主定价权，白酒的市场化才真正拉开序幕。</w:t>
+      </w:r>
+    </w:p>
+    <w:p>
+      <w:pPr/>
+      <w:r>
+        <w:t>所谓定价权，是指企业可根据自身品牌实力、成本、供需关系及竞争者状况进行灵活的调整价格。</w:t>
+      </w:r>
+    </w:p>
+    <w:p>
+      <w:pPr/>
+      <w:r>
+        <w:t>@价格一放，名酒企业就分道扬镳了。</w:t>
+      </w:r>
+    </w:p>
+    <w:p>
+      <w:pPr/>
+      <w:r>
+        <w:t>有的企业铁了心要涨价，一步步往高端形象上靠；有些企业更看重大众市场，希望借助名酒的光晕多卖些产品，覆盖更多消费者。</w:t>
+      </w:r>
+    </w:p>
+    <w:p>
+      <w:pPr/>
+      <w:r>
+        <w:t>这两种选择都是对的，走高端路线，单瓶利润高，在社交场合也更有面子；走大众化路线，销量大，渠道多。</w:t>
+      </w:r>
+    </w:p>
+    <w:p>
+      <w:pPr/>
+      <w:r>
+        <w:t>但是日子长了，我们会发现，高端品牌一旦深入人心，无论是赚钱能力，对渠道的影响力，还是消费者认知度，优势都会更加突出。</w:t>
+      </w:r>
+    </w:p>
+    <w:p>
+      <w:pPr/>
+      <w:r>
+        <w:t>要读懂这一阶段，需要理解“价格带”这一核心概念，简单来说，价格带是指消费者在一定场合下的心理可承受的价格范围。</w:t>
+      </w:r>
+    </w:p>
+    <w:p>
+      <w:pPr/>
+      <w:r>
+        <w:t>低端酒管的是平时自个儿喝或者老友聚餐；中端酒撑起家庭宴席和地方上的小生意；次高端酒用在更正式的社交场合；而高档酒是重要的请客和送礼之选。</w:t>
+      </w:r>
+    </w:p>
+    <w:p>
+      <w:pPr/>
+      <w:r>
+        <w:t>价格带之所以重要，是因为白酒不仅是喝口感，也是喝场景，如果一个品牌进入错误的价格段，经销商卖不出去货，压力自然就大了。</w:t>
+      </w:r>
+    </w:p>
+    <w:p>
+      <w:pPr/>
+      <w:r>
+        <w:t>税收政策的调整，也从背后助推了高端化，1994年以后，白酒消费税制度不断完善，改为从价与从量相结合征收。</w:t>
+      </w:r>
+    </w:p>
+    <w:p>
+      <w:pPr/>
+      <w:r>
+        <w:t>简单说，从价税看你卖多少钱，从量税看你卖多少瓶，对便宜酒而言，按瓶征收的从量税占了售价的大部分，利润微薄；而对贵酒，品牌溢价高，完全可以消化这部分税负。</w:t>
+      </w:r>
+    </w:p>
+    <w:p>
+      <w:pPr/>
+      <w:r>
+        <w:t>这样的制度环境，使企业更愿意做中高价位产品，后来市场上出现的青花汾酒、国窖1573、水井坊、舍得、蓝色经典等品牌，其实都是企业寻求更高利润空间和更好定位的结果。</w:t>
+      </w:r>
+    </w:p>
+    <w:p>
+      <w:pPr/>
+      <w:r>
+        <w:t>但是，高端化也并非没有成本，价格虽是企业决定的，但是最终买单的还是消费者、经销商以及终端门店。</w:t>
+      </w:r>
+    </w:p>
+    <w:p>
+      <w:pPr/>
+      <w:r>
+        <w:t>消费者要是觉得不值，高价只会把人挡在门外；经销商要是赚不到钱，高价就成了压在仓库里的风险；终端没有动力去推，酒就无法进入真正的消费市场。</w:t>
+      </w:r>
+    </w:p>
+    <w:p>
+      <w:pPr/>
+      <w:r>
+        <w:t>@很多企业行情好时，认为只要涨价就能提升形象，待到需求萎缩后才发觉，价格越高，渠道压力越大。</w:t>
+      </w:r>
+    </w:p>
+    <w:p>
+      <w:pPr/>
+      <w:r>
+        <w:t>这点对于白酒行业尤其重要，白酒价格是由出厂价、一批价、批发价、店里挂的标价以及最后的成交价串起来的一套体系。</w:t>
+      </w:r>
+    </w:p>
+    <w:p>
+      <w:pPr/>
+      <w:r>
+        <w:t>白酒企业拼命往高端走，本质是追求一个长期、稳定的价格秩序，而不是仅仅要在瓶子上贴个更贵的标签。</w:t>
+      </w:r>
+    </w:p>
+    <w:p>
+      <w:pPr/>
+      <w:r>
+        <w:t>这个行当，酒质是底线，历史是加成，但是仅凭这两样还是不够的。</w:t>
+      </w:r>
+    </w:p>
+    <w:p>
+      <w:pPr/>
+      <w:r>
+        <w:t>一家酒厂能否活得下去，要看它是否能回答好三个关键问题：产品的目标消费场景是什么？渠道商凭什么愿意掏真金白银来支持你？消费者在那些最重要的场合，是否真的愿意选你？</w:t>
+      </w:r>
+    </w:p>
+    <w:p>
+      <w:pPr/>
+      <w:r>
+        <w:t>如果这三个问题答得漂亮，价格就是品牌的金字招牌；如果答不上来，价格就成了压垮渠道的重担。</w:t>
+      </w:r>
+    </w:p>
+    <w:p>
+      <w:pPr/>
+      <w:r>
+        <w:t>这也说明了白酒行业为何总与宏观经济同频共振，大家对未来有希望的时候，商务宴请、礼尚往来、消费升级就会很旺盛，高价酒当然好卖；一旦预期变弱，大家捂紧口袋，经销商缩手缩脚，整个价格体系将承受巨大压力。</w:t>
+      </w:r>
+    </w:p>
+    <w:p>
+      <w:pPr/>
+    </w:p>
+    <w:p>
+      <w:pPr>
+        <w:pStyle w:val="Heading2"/>
+      </w:pPr>
+      <w:r>
+        <w:t>！！！5. 渠道</w:t>
+      </w:r>
+    </w:p>
+    <w:p>
+      <w:pPr/>
+      <w:r>
+        <w:t>渠道是白酒从酒厂到酒桌的必经之路，这其中穿插了经销商、批发商、烟酒店、餐厅、超市、电商和厂家自营商城。</w:t>
+      </w:r>
+    </w:p>
+    <w:p>
+      <w:pPr/>
+      <w:r>
+        <w:t>渠道之所以是命脉，是因为白酒消费往往不是单纯的“搜索购买”，很多时候，一瓶酒能否卖出去，取决于熟人的推荐、宴席的面子、柜台的陈列，或者经销商的人脉资源。</w:t>
+      </w:r>
+    </w:p>
+    <w:p>
+      <w:pPr/>
+      <w:r>
+        <w:t>谁能控制渠道，谁就把握了真实需求的脉搏，就有了对价格的发言权。</w:t>
+      </w:r>
+    </w:p>
+    <w:p>
+      <w:pPr/>
+      <w:r>
+        <w:t>21世纪初是白酒渠道疯狂扩张的黄金年代，经济起飞，商务应酬增多，再加上城镇化带来的消费升级，处处是商机。</w:t>
+      </w:r>
+    </w:p>
+    <w:p>
+      <w:pPr/>
+      <w:r>
+        <w:t>五粮液就是靠“大商制”、“贴牌模式”实现的规模突破。所谓大商制，就是酒厂找些资金雄厚、路子宽的大经销商，将一个省甚至几个省的市场全部交托给它们。</w:t>
+      </w:r>
+    </w:p>
+    <w:p>
+      <w:pPr/>
+      <w:r>
+        <w:t>2005年，五粮液前五大经销商收入占到了70%以上，可见大商制的力量。</w:t>
+      </w:r>
+    </w:p>
+    <w:p>
+      <w:pPr/>
+      <w:r>
+        <w:t>但是大商制度的副作用也是明显的，经销商权力过大，酒厂就成了“甩手掌柜”，对终端市场变化反应不灵敏；贴牌产品太多，消费者也容易看花了眼，分不清哪个才是真正的主力产品；低价产品卖得过火，也会损害高端品牌形象。</w:t>
+      </w:r>
+    </w:p>
+    <w:p>
+      <w:pPr/>
+      <w:r>
+        <w:t>@行情差时，渠道也是放大器，当库存积压、利润下降时，经销商为了回笼资金而降价抛售，市场价格秩序便即刻崩溃。</w:t>
+      </w:r>
+    </w:p>
+    <w:p>
+      <w:pPr/>
+      <w:r>
+        <w:t>相比之下，茅台走了一条不同的路，长期深耕“小商制”，持续增强自营能力。</w:t>
+      </w:r>
+    </w:p>
+    <w:p>
+      <w:pPr/>
+      <w:r>
+        <w:t>小商制指的是厂家直接面对成百上千的小经销商，而自营是通过直营店、线上平台及企业团购，直面消费者。</w:t>
+      </w:r>
+    </w:p>
+    <w:p>
+      <w:pPr/>
+      <w:r>
+        <w:t>尽管这套体制管理起来很累、很繁琐，但是其优点是厂家对价格拥有绝对的控制权，市场反应也更加直接，渠道利润分配完全由厂家决定。</w:t>
+      </w:r>
+    </w:p>
+    <w:p>
+      <w:pPr/>
+      <w:r>
+        <w:t>对白酒这样重视品牌形象和价格敏感度的产品而言，渠道越扁平，企业越能够保持高端的品牌认知。</w:t>
+      </w:r>
+    </w:p>
+    <w:p>
+      <w:pPr/>
+      <w:r>
+        <w:t>区域酒企也在摸爬滚打中，练出了一套非常有地方特色的渠道打法，在江苏、安徽等地，许多企业实行厂家主导的“厂商一体”。简单说，就是厂家自己设办事处或分公司看市场，经销商后退一步，主要是做物流配送、资金周转以及部分的终端服务。</w:t>
+      </w:r>
+    </w:p>
+    <w:p>
+      <w:pPr/>
+      <w:r>
+        <w:t>这种方式在区域市场上很有效，因为厂家最熟悉当地的宴席习俗、餐饮习惯以及烟酒店的人脉关系，应对价格波动、促销活动和货架摆放，反应也更快。</w:t>
+      </w:r>
+    </w:p>
+    <w:p>
+      <w:pPr/>
+      <w:r>
+        <w:t>比如洋河的蓝色经典、古井贡酒的年份原浆系列，之所以能够拥有今天的江湖地位，很大程度上得益于这种精细化的区域深耕。</w:t>
+      </w:r>
+    </w:p>
+    <w:p>
+      <w:pPr/>
+      <w:r>
+        <w:t>@生意上没有永远正确的模式，要看品牌在什么位置，产品卖什么价格，和正在经历怎样的市场周期。</w:t>
+      </w:r>
+    </w:p>
+    <w:p>
+      <w:pPr/>
+      <w:r>
+        <w:t>电商平台的兴起，使渠道的权力结构再度重组，厂家经由线上直营店可与消费者直接对话，而平台透明的价格也使各地的价差无处藏身。</w:t>
+      </w:r>
+    </w:p>
+    <w:p>
+      <w:pPr/>
+      <w:r>
+        <w:t>对酒厂来说，这是一个了解用户、维护品牌的好机会；但对于传统的经销商来说，这是利润空间被压缩的挑战。</w:t>
+      </w:r>
+    </w:p>
+    <w:p>
+      <w:pPr/>
+      <w:r>
+        <w:t>现在白酒的渠道竞争，是一场关于价格、库存、数据和终端服务的大考验。</w:t>
+      </w:r>
+    </w:p>
+    <w:p>
+      <w:pPr/>
+    </w:p>
+    <w:p>
+      <w:pPr>
+        <w:pStyle w:val="Heading2"/>
+      </w:pPr>
+      <w:r>
+        <w:t>！！！6. 高端逻辑</w:t>
+      </w:r>
+    </w:p>
+    <w:p>
+      <w:pPr/>
+      <w:r>
+        <w:t>高端白酒的价值，如果只看粮食和酒精成本，是算不清的，它包含着品质、品牌、历史，以及稀缺性和社交场合的体面。</w:t>
+      </w:r>
+    </w:p>
+    <w:p>
+      <w:pPr/>
+      <w:r>
+        <w:t>你在便利店买瓶水，图的是解渴和便宜；但重要饭局上选酒你要考虑对方认不认、场合配不配、拿出来够不够格。</w:t>
+      </w:r>
+    </w:p>
+    <w:p>
+      <w:pPr/>
+      <w:r>
+        <w:t>@高端白酒之所以历久弥新，关键在于其作为正式社交中的某种“信号”，而这个信号的功能有一个很有趣的现象：购买者、饮用者以及决定买什么酒的人，常常不是同一批人。</w:t>
+      </w:r>
+    </w:p>
+    <w:p>
+      <w:pPr/>
+      <w:r>
+        <w:t>支付者与使用者分离后，人们对价格的敏感性下降，名酒的品牌效应增强，毕竟这种场合下，选择一个大家都知道的大牌子，总比选择一个名气小但是可能更好的牌子保险些。</w:t>
+      </w:r>
+    </w:p>
+    <w:p>
+      <w:pPr/>
+      <w:r>
+        <w:t>高端白酒的立足之地，在于一个“稀缺”的共识，这种稀缺感，是产区的唯一性、漫长的生产周期、雄厚的基酒储备和稳定的价格体系造就的。</w:t>
+      </w:r>
+    </w:p>
+    <w:p>
+      <w:pPr/>
+      <w:r>
+        <w:t>比如酱香酒，由于生产周期长，人们自然明白为何它“供不应求”。</w:t>
+      </w:r>
+    </w:p>
+    <w:p>
+      <w:pPr/>
+      <w:r>
+        <w:t>浓香名酒则靠老窖池说话，让消费者明白“老窖出好酒”的硬道理。</w:t>
+      </w:r>
+    </w:p>
+    <w:p>
+      <w:pPr/>
+      <w:r>
+        <w:t>而清香型名酒则以发掘历史文化和推出高端产品为手段，重塑了自身的品质高度。</w:t>
+      </w:r>
+    </w:p>
+    <w:p>
+      <w:pPr/>
+      <w:r>
+        <w:t>2013年后，高端白酒行业发生了一次深刻转型，当时公共宴请大减，外界一度担忧高价酒将失其本，但私家消费及商务需要，迅即补足空缺。</w:t>
+      </w:r>
+    </w:p>
+    <w:p>
+      <w:pPr/>
+      <w:r>
+        <w:t>数据显示，白酒的私人消费占到2011年不到20%，增长到2017年的60%左右。</w:t>
+      </w:r>
+    </w:p>
+    <w:p>
+      <w:pPr/>
+      <w:r>
+        <w:t>这种变化说明，高端白酒不再拘泥于某种特定的场合，其消费人群也发生了结构性的改变。</w:t>
+      </w:r>
+    </w:p>
+    <w:p>
+      <w:pPr/>
+      <w:r>
+        <w:t>@更深一层的逻辑是，随着消费升级，更多人愿意为一份更加稳定、更加出名、更具文化的产品买单。</w:t>
+      </w:r>
+    </w:p>
+    <w:p>
+      <w:pPr/>
+      <w:r>
+        <w:t>高端白酒市场集中度极高，茅台、五粮液、泸州老窖三家公司，长期占据绝大多数的市场份额，合计份额一度超过90%。</w:t>
+      </w:r>
+    </w:p>
+    <w:p>
+      <w:pPr/>
+      <w:r>
+        <w:t>这个格局说明，高端市场不是谁都能进去的，虽然很多酒企都出了千元级的产品，但并不代表消费者会在正式场合买单。</w:t>
+      </w:r>
+    </w:p>
+    <w:p>
+      <w:pPr/>
+      <w:r>
+        <w:t>真正的大牌，需要时间沉淀下来的公信力，需要渠道商维护价格，更需要消费者在每一次关键节点上的反复抉择。</w:t>
+      </w:r>
+    </w:p>
+    <w:p>
+      <w:pPr/>
+      <w:r>
+        <w:t>高端逻辑中也有风险，价格越高越需要信心。如果大家认为这个品牌可靠、稀少、带出去有面子，那高价就是品牌的加成；但是一旦渠道发现货卖不出去，高价就会成为沉重的包袱。</w:t>
+      </w:r>
+    </w:p>
+    <w:p>
+      <w:pPr/>
+      <w:r>
+        <w:t>@所以，高端白酒企业真正的本事，是能否保持一个大家都能受益的秩序。</w:t>
+      </w:r>
+    </w:p>
+    <w:p>
+      <w:pPr/>
+      <w:r>
+        <w:t>唯有消费者要买、经销商敢存、终端店爱卖、厂家能准确调控供应与价格，品牌才会长盛不衰。</w:t>
+      </w:r>
+    </w:p>
+    <w:p>
+      <w:pPr/>
+      <w:r>
+        <w:t>这种秩序一旦建立，后来者几乎无法复制；但是一旦秩序松懈了，要恢复过来也很难。</w:t>
+      </w:r>
+    </w:p>
+    <w:p>
+      <w:pPr/>
+      <w:r>
+        <w:t>白酒向高端发展的大势所趋，毕竟我们中国人在社交中离不开正式宴请和过年过节送礼，大家对好酒的需求始终存在，但是，现在要进入高端圈，门槛已经很高了。</w:t>
+      </w:r>
+    </w:p>
+    <w:p>
+      <w:pPr/>
+      <w:r>
+        <w:t>一个酒企要在高端价位上立住脚跟，需要的是过硬的品牌口碑和能给渠道赚钱的实力，如果只是换一个华美的包装，起一个高大上的名字，砸一些广告，那么在这样一个增长放缓的时代里，恐怕也难以持久。</w:t>
+      </w:r>
+    </w:p>
+    <w:p>
+      <w:pPr/>
+    </w:p>
+    <w:p>
+      <w:pPr>
+        <w:pStyle w:val="Heading2"/>
+      </w:pPr>
+      <w:r>
+        <w:t>！！！7. 库存压力</w:t>
+      </w:r>
+    </w:p>
+    <w:p>
+      <w:pPr/>
+      <w:r>
+        <w:t>库存对白酒行业来说是致命的，因为它决定着老板们是否愿意继续进货，也决定着一瓶酒的价格能否撑得住。</w:t>
+      </w:r>
+    </w:p>
+    <w:p>
+      <w:pPr/>
+      <w:r>
+        <w:t>白酒圈里有一个经常说的词，叫“倒挂”，简单讲，就是市场上零售价格低于进货成本，经销商卖一瓶亏一瓶，只能靠厂家的返利或补贴才能活命。</w:t>
+      </w:r>
+    </w:p>
+    <w:p>
+      <w:pPr/>
+      <w:r>
+        <w:t>倒挂这事儿，影响极坏，消费者一看价格天天跌，肯定想再等等买；小店老板怕砸手里，也不敢多进货；厂家如果再坚持高出厂价，就是在割经销商的肉。</w:t>
+      </w:r>
+    </w:p>
+    <w:p>
+      <w:pPr/>
+      <w:r>
+        <w:t>回头看2012年左右，白酒行业跌过一次跤，那个时候先是“塑化剂”闹得人心慌，然后是限制三公消费的政策出台，需求一下子没了。</w:t>
+      </w:r>
+    </w:p>
+    <w:p>
+      <w:pPr/>
+      <w:r>
+        <w:t>但在此之前，很多酒厂都过于乐观，一边涨价扩产，一边向渠道放货，导致库存全部压在手上。</w:t>
+      </w:r>
+    </w:p>
+    <w:p>
+      <w:pPr/>
+      <w:r>
+        <w:t>从2013年到2016年，大家都在降价、砍产品线、收权，日子过得很难受。</w:t>
+      </w:r>
+    </w:p>
+    <w:p>
+      <w:pPr/>
+      <w:r>
+        <w:t>那几年给行业的教训很深：酒厂的报表再漂亮，如果酒没卖出去，那么这种繁荣是沙滩上的城堡，一冲即溃。</w:t>
+      </w:r>
+    </w:p>
+    <w:p>
+      <w:pPr/>
+      <w:r>
+        <w:t>当年一些高档酒出厂价格不断攀升，眼看就要突破千元大关，但老百姓不买账，对手也不跟进，销量自然下滑，最终只能通过降价来寻求平衡。</w:t>
+      </w:r>
+    </w:p>
+    <w:p>
+      <w:pPr/>
+      <w:r>
+        <w:t>这说明高端化，还是要看品牌是否有这个实力，一但价格太高卖不动，渠道为了回笼资金，最直接的方法就是甩货，结果价格体系全乱了。</w:t>
+      </w:r>
+    </w:p>
+    <w:p>
+      <w:pPr/>
+      <w:r>
+        <w:t>@以前行情好，经销商认为囤货可以升值，也比较容易卖，现在大家买酒更挑了，囤货逻辑变了。</w:t>
+      </w:r>
+    </w:p>
+    <w:p>
+      <w:pPr/>
+      <w:r>
+        <w:t>经销商现在更看中这酒资金压多长时间、厂家补多少钱、价格是否透明，毕竟房租、人工、物流的成本都在上涨，谁都不想再无休止的为酒厂背增长指标。</w:t>
+      </w:r>
+    </w:p>
+    <w:p>
+      <w:pPr/>
+      <w:r>
+        <w:t>2024年6月，白酒市场遭遇了较大波动，茅台的市场出货价一度跌至2200元左右，五粮液、国窖1573等高端白酒也陷入“价格倒挂”漩涡。</w:t>
+      </w:r>
+    </w:p>
+    <w:p>
+      <w:pPr/>
+      <w:r>
+        <w:t>价格一变，链条上的人个个在算计，酒厂看品牌形象和出货节奏，经销商担心库存贬值和现金流，终端店在乎能不能赚钱，而消费者在等价格是否还能再降一点。</w:t>
+      </w:r>
+    </w:p>
+    <w:p>
+      <w:pPr/>
+      <w:r>
+        <w:t>厂家若要硬撑稳价，就要减少发货、回购库存，甚至自贴渠道；但如果放任价格下跌，品牌的地位可能会被摧毁。不管走哪条路，付出都很大。</w:t>
+      </w:r>
+    </w:p>
+    <w:p>
+      <w:pPr/>
+      <w:r>
+        <w:t>库存压力也是产品矩阵问题，所谓的产品矩阵，是指酒企在不同价格、不同场合的产品布局。</w:t>
+      </w:r>
+    </w:p>
+    <w:p>
+      <w:pPr/>
+      <w:r>
+        <w:t>产品铺太杂，经销商无重点，消费者记不住，营销费用被摊薄；但如果产品单一，又担心满足不了多样化需求。</w:t>
+      </w:r>
+    </w:p>
+    <w:p>
+      <w:pPr/>
+      <w:r>
+        <w:t>现在调整期，很多酒企开始压缩产品线，发力于核心单品，因为核心产品更易稳定价格，也更易统一渠道。</w:t>
+      </w:r>
+    </w:p>
+    <w:p>
+      <w:pPr/>
+      <w:r>
+        <w:t>对白酒企业来说，真正的增长还是要看终端动销，而非把酒放在经销商的仓库里。终端动销，就是酒被真正地买走了，倒进了杯子里喝了，只有消费者愿意持续买账，渠道才赚钱，品牌的价格才有底气。</w:t>
+      </w:r>
+    </w:p>
+    <w:p>
+      <w:pPr/>
+      <w:r>
+        <w:t>增长慢的时候，企业不能光看发货快不快，得多看开瓶率、复购率、宴席占有率和真实成交价。</w:t>
+      </w:r>
+    </w:p>
+    <w:p>
+      <w:pPr/>
+      <w:r>
+        <w:t>@库存压力不会压垮整个行业，但它是试金石。</w:t>
+      </w:r>
+    </w:p>
+    <w:p>
+      <w:pPr/>
+      <w:r>
+        <w:t>品牌强、价格严控、库存低、产品线明确的企业，转身空间大；相反，品牌力弱、库存积压严重、只靠费用砸市场和渠道信心不足的企业，日子将越来越难。</w:t>
+      </w:r>
+    </w:p>
+    <w:p>
+      <w:pPr/>
+    </w:p>
+    <w:p>
+      <w:pPr>
+        <w:pStyle w:val="Heading2"/>
+      </w:pPr>
+      <w:r>
+        <w:t>！！！8. 区域市场</w:t>
+      </w:r>
+    </w:p>
+    <w:p>
+      <w:pPr/>
+      <w:r>
+        <w:t>中国的白酒市场从来没有统一过，各地都有各地的“地头蛇”和老传统，四川、贵州、江苏、安徽、湖北、湖南、山东、河南……每个地方的饮酒嗜好和渠道都不一样。</w:t>
+      </w:r>
+    </w:p>
+    <w:p>
+      <w:pPr/>
+      <w:r>
+        <w:t>区域市场之所以重要，在于它是众多中小酒厂生存的自留地，也是划分了全国性名酒扩张的势力范围。</w:t>
+      </w:r>
+    </w:p>
+    <w:p>
+      <w:pPr/>
+      <w:r>
+        <w:t>这种区域认同感是怎么来的？</w:t>
+      </w:r>
+    </w:p>
+    <w:p>
+      <w:pPr/>
+      <w:r>
+        <w:t>首先是口味，一方水土养一方人，喝惯了某一种香型或者品牌，舌头是有记性的。</w:t>
+      </w:r>
+    </w:p>
+    <w:p>
+      <w:pPr/>
+      <w:r>
+        <w:t>其次就是宴席传统，不管结婚、办丧事、搬家或是孩子上学，只要是本地人，谁喝哪个牌子的酒，主人就必须上那个牌子的酒。</w:t>
+      </w:r>
+    </w:p>
+    <w:p>
+      <w:pPr/>
+      <w:r>
+        <w:t>其次是渠道关系，本地的经销商、饭馆、烟酒店和团购大户间有长期的利益联系，外来品牌要想插足，重建信任成本巨大。</w:t>
+      </w:r>
+    </w:p>
+    <w:p>
+      <w:pPr/>
+      <w:r>
+        <w:t>最后还有份乡情，非正式聚会时大家更愿意支持家乡品牌。</w:t>
+      </w:r>
+    </w:p>
+    <w:p>
+      <w:pPr/>
+      <w:r>
+        <w:t>区域酒企，其实有一种不可替代的韧劲，尽管全国性的名酒在高端的礼品、重要的商务宴请中大放异彩，但在地方上婚丧嫁娶或老朋友聚会时，它们却不一定能够替代“地头蛇”们。</w:t>
+      </w:r>
+    </w:p>
+    <w:p>
+      <w:pPr/>
+      <w:r>
+        <w:t>@白酒消费从来都是一种生活场景的集合。</w:t>
+      </w:r>
+    </w:p>
+    <w:p>
+      <w:pPr/>
+      <w:r>
+        <w:t>低端与大众价格区的竞争往往比高端市场的竞争更加激烈，尽管红星二锅头、牛栏山、劲酒等全国品牌声名远播，但整个低端市场仍十分分散，全国性品牌并未占据压倒性优势。</w:t>
+      </w:r>
+    </w:p>
+    <w:p>
+      <w:pPr/>
+      <w:r>
+        <w:t>原因很简单：低端酒对价格非常敏感，物流成本，促销力度与终端店的关系都直接决定着那点可怜的利润。</w:t>
+      </w:r>
+    </w:p>
+    <w:p>
+      <w:pPr/>
+      <w:r>
+        <w:t>加上消费者对本地口味的依赖以及购买的便捷性，外来品牌难以短期内与本地品牌的竞争优势抗衡。</w:t>
+      </w:r>
+    </w:p>
+    <w:p>
+      <w:pPr/>
+      <w:r>
+        <w:t>@对区域酒企而言，盲目追求全国化常有大风险。</w:t>
+      </w:r>
+    </w:p>
+    <w:p>
+      <w:pPr/>
+      <w:r>
+        <w:t>走出去，就要砸广告、铺渠道、养队伍，还要做品牌教育和价格管理，这些成本远高于在自家门口深耕。</w:t>
+      </w:r>
+    </w:p>
+    <w:p>
+      <w:pPr/>
+      <w:r>
+        <w:t>更重要的是，离开核心根据地后，这种地方感情的加成和熟人社会的渠道优势失效了，产品只能与其他省份的强势品牌硬拼。</w:t>
+      </w:r>
+    </w:p>
+    <w:p>
+      <w:pPr/>
+      <w:r>
+        <w:t>很多地方酒厂在老家称王称霸，一出家门就增长乏力，问题就在这里。</w:t>
+      </w:r>
+    </w:p>
+    <w:p>
+      <w:pPr/>
+      <w:r>
+        <w:t>当然，地区公司也离不开吃老本，在增长放缓时代，人口流动、年轻人喝酒习惯的改变、宴请消费的节制和健康意识的提高，正在悄然改变着本地的需求。</w:t>
+      </w:r>
+    </w:p>
+    <w:p>
+      <w:pPr/>
+      <w:r>
+        <w:t>区域酒企要将产品角色分得更明确一些：哪些酒是做大众宴席用的，哪些酒是做商务接待的，哪些酒是赚利润的，哪些酒是为了保持渠道覆盖的。</w:t>
+      </w:r>
+    </w:p>
+    <w:p>
+      <w:pPr/>
+      <w:r>
+        <w:t>若产品线杂乱无章，只会浪费有限的渠道资源。</w:t>
+      </w:r>
+    </w:p>
+    <w:p>
+      <w:pPr/>
+      <w:r>
+        <w:t>对于区域酒企来说，最实际的竞争策略一般有三条。</w:t>
+      </w:r>
+    </w:p>
+    <w:p>
+      <w:pPr/>
+      <w:r>
+        <w:t>首先是巩固大本营，做好本地餐饮、烟酒店、宴席和团购服务，让消费者在关键时刻第一个想到你。</w:t>
+      </w:r>
+    </w:p>
+    <w:p>
+      <w:pPr/>
+      <w:r>
+        <w:t>其次提价要慎重，避免盲目跟随全国高端品牌定价，增加经销商的库存风险。</w:t>
+      </w:r>
+    </w:p>
+    <w:p>
+      <w:pPr/>
+      <w:r>
+        <w:t>最后，采用“蚕食”的方式，先向周边文化相近的地区逐步扩展，而非一步到位，一开始就想要铺满全国。</w:t>
+      </w:r>
+    </w:p>
+    <w:p>
+      <w:pPr/>
+      <w:r>
+        <w:t>大家买酒的时候，不能光看全国知名度，还要看具体用途，如果是本地婚宴，乡亲们的认可度可能更重要；如果是跨省的商务往来，选全国性名酒最稳妥；如果是在家自己喝，品质和性价比才最重要。</w:t>
+      </w:r>
+    </w:p>
+    <w:p>
+      <w:pPr/>
+      <w:r>
+        <w:t>@未来白酒行业将不断向头部集中，但不代表地方品牌会全部消失。</w:t>
+      </w:r>
+    </w:p>
+    <w:p>
+      <w:pPr/>
+      <w:r>
+        <w:t>大品牌拿走更多利润，高端场景更趋名酒，小作坊退出，但区域强势品牌仍能守得住一亩三分地。</w:t>
+      </w:r>
+    </w:p>
+    <w:p>
+      <w:pPr/>
+      <w:r>
+        <w:t>真正痛苦的是“三无”企业：既没有全国知名度，也没有本地强势渠道，更没有明确的价格带。他们既够不到高端竞争的门槛，又无法在大众市场上玩转效率，这才是最可怕的。</w:t>
+      </w:r>
+    </w:p>
+    <w:p>
+      <w:pPr/>
+    </w:p>
+    <w:p>
+      <w:pPr>
+        <w:pStyle w:val="Heading2"/>
+      </w:pPr>
+      <w:r>
+        <w:t>！！！9. 年轻客群</w:t>
+      </w:r>
+    </w:p>
+    <w:p>
+      <w:pPr/>
+      <w:r>
+        <w:t>现在的酒厂基本都在说年轻人，道理大家都知道：老一代的核心酒友年龄大了，传统的酒桌应酬也少了，企业只能为将来找出路。</w:t>
+      </w:r>
+    </w:p>
+    <w:p>
+      <w:pPr/>
+      <w:r>
+        <w:t>年轻人的重要性在于他们掌握着品牌的长久生命力，决定白酒能否在未来社交圈中占据一席之地。</w:t>
+      </w:r>
+    </w:p>
+    <w:p>
+      <w:pPr/>
+      <w:r>
+        <w:t>但是，要打动年轻人，单靠换包装、搞联名是远远不够的。</w:t>
+      </w:r>
+    </w:p>
+    <w:p>
+      <w:pPr/>
+      <w:r>
+        <w:t>对现在的年轻人来说，白酒面前摆着三道坎：</w:t>
+      </w:r>
+    </w:p>
+    <w:p>
+      <w:pPr/>
+      <w:r>
+        <w:t>一是度数太高，入口太辣，得有个适应过程；</w:t>
+      </w:r>
+    </w:p>
+    <w:p>
+      <w:pPr/>
+      <w:r>
+        <w:t>二是场景太严肃，总跟长辈、生意和规矩捆在一起，喝起来不自在；</w:t>
+      </w:r>
+    </w:p>
+    <w:p>
+      <w:pPr/>
+      <w:r>
+        <w:t>三是年轻人健康意识较强，对于过量饮酒这件事比较排斥。</w:t>
+      </w:r>
+    </w:p>
+    <w:p>
+      <w:pPr/>
+      <w:r>
+        <w:t>@如果酒厂认为年轻人只喜欢潮牌设计、明星代言或刷刷活动，那么可能高估了这些营销的转化率。</w:t>
+      </w:r>
+    </w:p>
+    <w:p>
+      <w:pPr/>
+      <w:r>
+        <w:t>这些年，我们见证了酒企不断举办节庆活动、建立粉丝社群、赞助体育赛事，甚至跨界推出各类文化周边。</w:t>
+      </w:r>
+    </w:p>
+    <w:p>
+      <w:pPr/>
+      <w:r>
+        <w:t>这些动作的背后，是酒企想要跳出死板的饭局，去到更大的生活方式中。</w:t>
+      </w:r>
+    </w:p>
+    <w:p>
+      <w:pPr/>
+      <w:r>
+        <w:t>这些尝试是必要的，因为白酒过去依赖熟人介绍，现在年轻人长在互联网里，品牌要另想办法与之打招呼。</w:t>
+      </w:r>
+    </w:p>
+    <w:p>
+      <w:pPr/>
+      <w:r>
+        <w:t>@但是要知道，这些动作现在更多是刷脸，想要年轻人马上大口喝起来，还有一段距离。</w:t>
+      </w:r>
+    </w:p>
+    <w:p>
+      <w:pPr/>
+      <w:r>
+        <w:t>电商与数字化也颠覆了白酒圈的信息规则，数字会员系统可以清晰地记录谁在买，哪里买，喜欢什么口味，加上二维码、芯片、特制瓶盖等防伪溯源技术，真假一扫即明。</w:t>
+      </w:r>
+    </w:p>
+    <w:p>
+      <w:pPr/>
+      <w:r>
+        <w:t>对厂家来说，这能防假货、抓窜货、摸清用户画像；但是对经销商来说，以前靠信息差赚差价的时代真的越来越难了。</w:t>
+      </w:r>
+    </w:p>
+    <w:p>
+      <w:pPr/>
+      <w:r>
+        <w:t>科技的力量也渗入到生产线上，现代的检测设备可以精确分析酒中的香味成分，自动化流水线使制曲、发酵、灌装至入库更加高效，数据系统可协助管理基酒库存。</w:t>
+      </w:r>
+    </w:p>
+    <w:p>
+      <w:pPr/>
+      <w:r>
+        <w:t>这些技术之所以重要，是由于白酒在大量生产中，质量的稳定比偶遇一坛神仙酒更可贵。</w:t>
+      </w:r>
+    </w:p>
+    <w:p>
+      <w:pPr/>
+      <w:r>
+        <w:t>@科技提高了质量的一致性与供应链效率，但我们也要知道，技术可以改善管理，却无法创造出产区的历史底蕴、老窖池的微生物环境和沉淀了多年的品牌信任。</w:t>
+      </w:r>
+    </w:p>
+    <w:p>
+      <w:pPr/>
+      <w:r>
+        <w:t>其实，白酒年轻化的最大障碍就是缺少场景，啤酒可以配夜宵看球，红酒可以配西餐小饮，低度酒可以做轻社交，白酒长期绑定的是那些重礼节的正式场合。</w:t>
+      </w:r>
+    </w:p>
+    <w:p>
+      <w:pPr/>
+      <w:r>
+        <w:t>@年轻人更注重自愿、轻松和适量，口味也要合适，如果白酒还不能走出“劝酒文化”的阴影，想要年轻人真正接受，是很难的。</w:t>
+      </w:r>
+    </w:p>
+    <w:p>
+      <w:pPr/>
+      <w:r>
+        <w:t>企业可以尝试低度化、小瓶化，或开体验店、做品鉴教育和餐酒搭配，但这些尝试得有边界。低度化不等于牺牲核心味道，小瓶化不等于换包装卖高价，体验店不等于网红打卡点，品鉴教育不等于堆术语。</w:t>
+      </w:r>
+    </w:p>
+    <w:p>
+      <w:pPr/>
+      <w:r>
+        <w:t>年轻人心中有一杆秤，他们愿意为真实体验买单，但不愿为强行编造的身份叙事买单。</w:t>
+      </w:r>
+    </w:p>
+    <w:p>
+      <w:pPr/>
+      <w:r>
+        <w:t>线上的营销还有一个副作用就是价格透明，这降低了高端产品的神秘性，以前不同地方、不同店家价格差异大，消费者难以比较。现在好了，平台价，直播价，团购价，甚至回收价，一指头就查到了，若品牌渠道管理不及时，年轻人很快会发现价格乱象，质疑品牌。</w:t>
+      </w:r>
+    </w:p>
+    <w:p>
+      <w:pPr/>
+      <w:r>
+        <w:t>归根结底，白酒年轻化的关键，是给年轻人一个重新举起酒杯的借口。</w:t>
+      </w:r>
+    </w:p>
+    <w:p>
+      <w:pPr/>
+      <w:r>
+        <w:t>这个理由也可以更纯粹一些，比如更好的质量、更明确的搭配建议、更健康的饮酒文化，或者更透明的购买渠道。</w:t>
+      </w:r>
+    </w:p>
+    <w:p>
+      <w:pPr/>
+      <w:r>
+        <w:t>企业要认识到，新一代消费者无须承担起继承过时酒桌文化的义务，谁提供负担更小、更可靠、更贴近现代生活的商品和服务，谁才可能在存量市场上抢到增量。</w:t>
+      </w:r>
+    </w:p>
+    <w:p>
+      <w:pPr/>
+    </w:p>
+    <w:p>
+      <w:pPr>
+        <w:pStyle w:val="Heading2"/>
+      </w:pPr>
+      <w:r>
+        <w:t>！！！10. 白酒消费与投资指南</w:t>
+      </w:r>
+    </w:p>
+    <w:p>
+      <w:pPr/>
+      <w:r>
+        <w:t>普通人买白酒，最重要是不要被天价，故事，所谓稀缺性带偏了。</w:t>
+      </w:r>
+    </w:p>
+    <w:p>
+      <w:pPr/>
+      <w:r>
+        <w:t>白酒有品质之分、品牌之贵，但不是所有的高价都是物超所值，也不是便宜的就不行。</w:t>
+      </w:r>
+    </w:p>
+    <w:p>
+      <w:pPr/>
+      <w:r>
+        <w:t>买酒之前先考虑用途：自饮、送礼、办婚宴，或是商务接待、收藏乃至加盟经营？用处不一样，判断标准也就不一样。</w:t>
+      </w:r>
+    </w:p>
+    <w:p>
+      <w:pPr/>
+      <w:r>
+        <w:t>如果自己喝，第一原则是控制好度和预算，白酒度数高，喝多了伤身体。没有必要为了显摆自己懂酒而盲目追高，也不要一次性购买过多没有尝试过的酒。</w:t>
+      </w:r>
+    </w:p>
+    <w:p>
+      <w:pPr/>
+      <w:r>
+        <w:t>稳妥的做法是先确定喜欢的香型和可以接受的价格，从正规渠道购买一点小瓶装或者少买两瓶，喝着舒服再回购。</w:t>
+      </w:r>
+    </w:p>
+    <w:p>
+      <w:pPr/>
+      <w:r>
+        <w:t>如果是要送礼的话，第一原则就是看场合和关系。</w:t>
+      </w:r>
+    </w:p>
+    <w:p>
+      <w:pPr/>
+      <w:r>
+        <w:t>去外地或参加正式场合，选择全国性的名酒最保险，大家都会认可，沟通成本低；要是本地聚会或熟人走动，当地的老牌子可能更亲切；对于关系好的朋友，了解对方的口味喜好比看价格更重要。</w:t>
+      </w:r>
+    </w:p>
+    <w:p>
+      <w:pPr/>
+      <w:r>
+        <w:t>礼品酒的价值不仅在酒上，也在对方是否领情，冷门高价货，如果对方不了解的话，花再多的钱也不一定有效果。</w:t>
+      </w:r>
+    </w:p>
+    <w:p>
+      <w:pPr/>
+      <w:r>
+        <w:t>最后，购买渠道一定要正规，厂家直营店、大型超市、品牌授权店或信誉良好的电商自营及官方旗舰店，远比不知名的低价渠道可靠。</w:t>
+      </w:r>
+    </w:p>
+    <w:p>
+      <w:pPr/>
+      <w:r>
+        <w:t>如果价格明显低于市场价格，要小心，白酒造假最善于利用贪便宜、求稀缺心理，诸如“内供”、“特供”、“军供”、“关系货”、“抵债酒”，或“原箱收藏”、“老酒清仓”，这些概念听一听就好。</w:t>
+      </w:r>
+    </w:p>
+    <w:p>
+      <w:pPr/>
+      <w:r>
+        <w:t>碰到年份酒、老酒更要小心些，现在的“年份”概念很混乱，有的是基酒的年份，有的只是其中一部分酒体的年份，甚至有的只是一个产品系列的名字。</w:t>
+      </w:r>
+    </w:p>
+    <w:p>
+      <w:pPr/>
+      <w:r>
+        <w:t>老酒更复杂，真假、保存条件、是否跑酒、瓶口封的好坏，都影响价值。加上市场流动性差、鉴定成本高，如果没有专业的渠道和眼力，切勿将老酒视为简单的理财产品。</w:t>
+      </w:r>
+    </w:p>
+    <w:p>
+      <w:pPr/>
+      <w:r>
+        <w:t>@收藏白酒，品牌、品相、渠道、保存条件以及变现途径必不可少，少了任何一个环节，手中的酒可能会毁在手中。</w:t>
+      </w:r>
+    </w:p>
+    <w:p>
+      <w:pPr/>
+      <w:r>
+        <w:t>办婚宴或大采购，稳定供应与售后服务最重要，不要只看单瓶的价格，要确定他们是否能准时送货，是否支持退换，是否可以开票。还要看是否能保证同批或相近批次的酒，是否有临期促销或包装破损等。</w:t>
+      </w:r>
+    </w:p>
+    <w:p>
+      <w:pPr/>
+      <w:r>
+        <w:t>婚宴用酒量大，万一渠道不对，中间断货补不了，就麻烦了，与其为省钱冒险，不如选择口碑好渠道强售后服务清晰的产品，买个放心。</w:t>
+      </w:r>
+    </w:p>
+    <w:p>
+      <w:pPr/>
+      <w:r>
+        <w:t>如果想加盟烟酒店、代理白酒或进入这个行业，库存和现金流是你的命根子。不要只听厂家或者上级代理说市场多大，要实地考察一下核心产品的实际成交价格是否稳定，下面的经销商到底有没有赚钱，产品在终端流转的速度有多快，回款周期需要多久。</w:t>
+      </w:r>
+    </w:p>
+    <w:p>
+      <w:pPr/>
+      <w:r>
+        <w:t>还要看厂家的费用政策是否透明，是否有强制搭售，若发现价格倒挂、库存积压、返利难以兑现，或产品线混乱不堪，则都是危险信号，需及时撤离。</w:t>
+      </w:r>
+    </w:p>
+    <w:p>
+      <w:pPr/>
+      <w:r>
+        <w:t>研究白酒公司，要学会拆分几个价格。</w:t>
+      </w:r>
+    </w:p>
+    <w:p>
+      <w:pPr/>
+      <w:r>
+        <w:t>出厂价是酒厂对渠道的价格，一批价是批发市场风向标，终端价是店里的挂牌价，而真实成交价才是消费者出的钱。</w:t>
+      </w:r>
+    </w:p>
+    <w:p>
+      <w:pPr/>
+      <w:r>
+        <w:t>这些价格，只看一个都不全。出厂价涨了，消费者不一定买账；终端标价高，不代表卖得好；一批价有浮动，并不代表品牌不行。要把库存、动销、渠道利润和现金流结合起来看，才看得出来。</w:t>
+      </w:r>
+    </w:p>
+    <w:p>
+      <w:pPr/>
+      <w:r>
+        <w:t>普通人最易被“稀缺”之类的话骗，白酒当然有稀缺品种，也有时间价值，但是稀缺是否能变现，要看品牌共识、真伪可信度、保存状态以及市场需求和交易渠道。</w:t>
+      </w:r>
+    </w:p>
+    <w:p>
+      <w:pPr/>
+      <w:r>
+        <w:t>@很多产品刚出来的时候喊着限量，过几年可能都没人接盘，限量不保值，大家都愿意买，能卖得出去，流动性才是收藏品变现的核心。</w:t>
+      </w:r>
+    </w:p>
+    <w:p>
+      <w:pPr/>
+      <w:r>
+        <w:t>找信息时，尽可能多看看企业公告、正规媒体、行业协会数据，或到品牌官网与多家终端比价。</w:t>
+      </w:r>
+    </w:p>
+    <w:p>
+      <w:pPr/>
+      <w:r>
+        <w:t>凡是打着极端词汇制造焦虑，拍胸脯保证升值，催促你赶快打款锁货，或把复杂的行业生意说成是捡钱的机会信息，你都要冷处理，不要被热血冲昏头脑。</w:t>
+      </w:r>
+    </w:p>
+    <w:p>
+      <w:pPr/>
+      <w:r>
+        <w:t>白酒行业未来竞争的核心，在于在谁能够率先适应“慢增长。”这种慢增长，即真实饮用的需求，送礼的需求，商务应酬和库存周转的关系更复杂了。</w:t>
+      </w:r>
+    </w:p>
+    <w:p>
+      <w:pPr/>
+      <w:r>
+        <w:t>@企业不能继续以为渠道永远接货或消费者永远买单高价新品，现在的增长，要在动销、利润与品牌秩序间取得平衡。</w:t>
+      </w:r>
+    </w:p>
+    <w:p>
+      <w:pPr/>
+      <w:r>
+        <w:t>对头部名酒企业来说，头等大事就是要保住自己的“价格信用”，让消费者和经销商心中有数，相信这个品牌的价位是稳定的，手中的货不会突然间大幅缩水。</w:t>
+      </w:r>
+    </w:p>
+    <w:p>
+      <w:pPr/>
+      <w:r>
+        <w:t>这事很重要，因为高端白酒的社交面子与价格秩序捆绑在了一起，保持这种信用就要控制发货速度，管理渠道库存，打击窜货，保护经销商利润，更要是在市场需求低迷时，抑制住为短期冲销量而乱放货的欲望。</w:t>
+      </w:r>
+    </w:p>
+    <w:p>
+      <w:pPr/>
+      <w:r>
+        <w:t>第二项工作是管理产品的边界，头部品牌是有能力出新品的，但新产品如果太杂，不但让消费者看花眼，也给渠道塞了一堆多余的库存。</w:t>
+      </w:r>
+    </w:p>
+    <w:p>
+      <w:pPr/>
+      <w:r>
+        <w:t>核心大单品是稳定基本盘，高端非标产品做差异化和送礼，大众产品做铺市养新客，每个产品都要有分工。</w:t>
+      </w:r>
+    </w:p>
+    <w:p>
+      <w:pPr/>
+      <w:r>
+        <w:t>@如果自己的产品互殴，价格混乱一片，品牌会在内耗中丧失全部的信任。</w:t>
+      </w:r>
+    </w:p>
+    <w:p>
+      <w:pPr/>
+      <w:r>
+        <w:t>而对于次高端、区域性酒企来说，关键是要找到自己能打的“地盘”，高端名酒占据了全国性的正式场合，地方品牌就要用好本地的婚丧嫁娶、地方商务和熟人社交，以价格优势和地缘亲近感，形成稳定消费圈。</w:t>
+      </w:r>
+    </w:p>
+    <w:p>
+      <w:pPr/>
+      <w:r>
+        <w:t>向全国扩张是可以的，但是要讲节奏，如果自己核心基地没有守好就急于外拓，往往落入了费用高、库存大的陷阱。</w:t>
+      </w:r>
+    </w:p>
+    <w:p>
+      <w:pPr/>
+      <w:r>
+        <w:t>低端和大众酒企的日子将更加难熬，大家的健康意识在提升，低价竞争又激烈，加上税收和渠道成本的压力，只靠走量越来越走不通了。</w:t>
+      </w:r>
+    </w:p>
+    <w:p>
+      <w:pPr/>
+      <w:r>
+        <w:t>这些公司要提升质量的稳定，不要再做低质低价的竞争，保住老百姓这根基本盘，同时把“性价比”说清楚。</w:t>
+      </w:r>
+    </w:p>
+    <w:p>
+      <w:pPr/>
+      <w:r>
+        <w:t>@大众酒有机会，但是要靠真实的复购率证明，而不是短期促销刷存在感。</w:t>
+      </w:r>
+    </w:p>
+    <w:p>
+      <w:pPr/>
+      <w:r>
+        <w:t>最后，数字化将成为基本功，它虽不能凭空创造需要，却可以帮助企业看到库存、价格和消费者的真面目。</w:t>
+      </w:r>
+    </w:p>
+    <w:p>
+      <w:pPr/>
+      <w:r>
+        <w:t>一个成熟的数字系统需要知道货卖到哪里去了，价格是否混乱，经销商手里货是否过多，哪些店真的开过瓶，哪些消费者在回头买。没有这些数据做支撑，企业很容易被报表上增长的假象所迷惑，从而做出错误的判断。</w:t>
+      </w:r>
+    </w:p>
+    <w:p>
+      <w:pPr/>
+      <w:r>
+        <w:t>白酒要想被年轻人和家庭消费者真正接纳，需要降低大家的心理压力，将品质做更透明。</w:t>
+      </w:r>
+    </w:p>
+    <w:p>
+      <w:pPr/>
+      <w:r>
+        <w:t>地方产区也要开窍了，白酒确实也是不少地方的纳税大头和名片，但增长放缓的周期中，盲目扩产、重复建设或过度包装，最终都将成为包袱。</w:t>
+      </w:r>
+    </w:p>
+    <w:p>
+      <w:pPr/>
+      <w:r>
+        <w:t>产区建设的重点应是质量标准、生态环保、品牌口碑、人才培育和供应链服务。</w:t>
+      </w:r>
+    </w:p>
+    <w:p>
+      <w:pPr/>
+      <w:r>
+        <w:t>白酒行业基础好、文化深、消费场景成熟、利润高，并且拥有了一批硬品牌和稳定的地方市场。但是，这些老底子却不能解决所有的新问题，喝酒的人越来越少，喝酒方式变了，渠道资金成本上升了，消费者越来越会玩，这些都是长期的。</w:t>
+      </w:r>
+    </w:p>
+    <w:p>
+      <w:pPr/>
+      <w:r>
+        <w:t>@如果企业还是固守老观念，把渠道当仓库，把年轻人当营销工具，把高端化等同于涨价，那么未来日子将越来越难。</w:t>
+      </w:r>
+    </w:p>
+    <w:p>
+      <w:pPr/>
+      <w:r>
+        <w:t>接下来的比赛，是看谁能更耐得住性子，企业需要敢于舍弃无用产品，宁愿短时间减少发货量也要保持价格稳定，愿意投入精力进行长期消费者教育，以数据管理渠道并承认每个市场都有天花板。</w:t>
+      </w:r>
+    </w:p>
+    <w:p>
+      <w:pPr/>
+      <w:r>
+        <w:t>白酒行业曾经拼过产能、拼过广告、拼过渠道和品牌，未来拼的是精细化经营。</w:t>
+      </w:r>
+    </w:p>
+    <w:p>
+      <w:pPr/>
+      <w:r>
+        <w:t>@谁在增长放缓的日子里能平衡好价格、库存、渠道和消费者，谁就能赢。</w:t>
+      </w:r>
+    </w:p>
+    <w:p>
+      <w:pPr/>
+      <w:r>
+        <w:t>这个行业还是属于那些品牌硬、渠道强、管理精的企业，也越来越属于那些懂得尊重市场真实变化的企业。</w:t>
+      </w:r>
+    </w:p>
+    <w:p>
+      <w:pPr>
+        <w:pStyle w:val="Heading2"/>
+      </w:pPr>
+      <w:r>
+        <w:t>B 反面案例：《越虐越上头：大脑为何迷恋痛感》</w:t>
+      </w:r>
+    </w:p>
+    <w:p>
+      <w:pPr/>
+      <w:r>
+        <w:t>案例定位：这是本指令明确指定的反面样稿，不是可模仿的文风范本。配套检测报告显示，稿件 14992 字，整体风险评分 50%（中风险）；报告识别出 4 类共性问题、约 17 处，其中包括“不是……而是……”等对比句过密、同一观点反复解释造成信息密度低、短句碎片式收尾，以及“核心是”等公式化小标题。阅读这篇稿件时，重点观察这些问题怎样在整章中累积：场景、概念、解释和建议常以相似结构重复出现，部分观点换例子后继续说一遍，从而形成明显的模板感。禁止把这种节奏带入新书。</w:t>
+      </w:r>
+    </w:p>
+    <w:p>
+      <w:pPr>
+        <w:pStyle w:val="Heading2"/>
+      </w:pPr>
+      <w:r>
+        <w:t>！！！导言</w:t>
+      </w:r>
+    </w:p>
+    <w:p>
+      <w:pPr/>
+      <w:r>
+        <w:t>你是否有过这样的时刻：被一段关系虐得无法安睡，但还是反复打开那个人的聊天框；明明知道一段剧情都是“刀”，但依旧流着眼泪划开下一条视频。朋友们劝你“适可而止”，你嘴上应着，甚至觉得确实有些道理，却始终无法在行动上落实。</w:t>
+      </w:r>
+    </w:p>
+    <w:p>
+      <w:pPr/>
+      <w:r>
+        <w:t>喜欢虐恋、沉迷嗑CP、跟忽冷忽热的人反复拉扯，这类状态涉及一个非常复杂的系统，它关乎奖励、依恋、记忆、疼痛、想象力以及社交需求。在为此自责之前，我们需要先理解大脑为什么会喜欢这种高强度的情绪。</w:t>
+      </w:r>
+    </w:p>
+    <w:p>
+      <w:pPr/>
+      <w:r>
+        <w:t>在此之后，真正需要审视的问题是，哪类痛感能留在虚构故事中给予你娱乐，哪些痛感却在悄然侵蚀着你的现实生活。</w:t>
+      </w:r>
+    </w:p>
+    <w:p>
+      <w:pPr/>
+    </w:p>
+    <w:p>
+      <w:pPr>
+        <w:pStyle w:val="Heading2"/>
+      </w:pPr>
+      <w:r>
+        <w:t>！！！第1章 越虐越上头</w:t>
+      </w:r>
+    </w:p>
+    <w:p>
+      <w:pPr/>
+      <w:r>
+        <w:t>有的人很喜欢看虐文，一章看完，评论区全是“刀死我了”，你的眼睛酸涩，胸口发堵，但嘴里说着“太难过了，受不了”，手却依旧点开了下一章。你一边为第二天要早起焦虑，为自己的“不自律”自责，一边却又在难受中品味到了一丝怪异的满足感。</w:t>
+      </w:r>
+    </w:p>
+    <w:p>
+      <w:pPr/>
+      <w:r>
+        <w:t>在人际关系中，也有十分类似的情状。你因为对方整天没回消息而坐立难安，反复查看对话框，查看对方的各个社交媒体，两天后他突然冒出一句话：“最近在忙。”你的胸口仿佛一块大石落地，甚至觉得之前的等待都是值得的。可过不了多久，他再次冷淡，而你再次进入焦虑等待的循环。别人觉得你在反复被伤害，只有你自己知道，你等到那条回复的时候经历了怎样的情绪强度。</w:t>
+      </w:r>
+    </w:p>
+    <w:p>
+      <w:pPr/>
+      <w:r>
+        <w:t>@“虐恋情绪”是一种特殊的情绪模式：痛苦、期待、失落、补偿和幻想交织在一起，人虽然难受，甚至知道这种模式不健康，但难以抽离。</w:t>
+      </w:r>
+    </w:p>
+    <w:p>
+      <w:pPr/>
+      <w:r>
+        <w:t>这样的状态可能发生在追剧嗑CP的时候，也可能存在于暧昧、暗恋、分分合合或忽冷忽热的不稳定感情中。有人以为喜欢这种“虐感”是天生“受虐狂”，但事实上，人并不会单纯地喜欢痛苦，我们喜欢的是痛苦后的意义感、亲密感、补偿和被确认的安全感。</w:t>
+      </w:r>
+    </w:p>
+    <w:p>
+      <w:pPr/>
+      <w:r>
+        <w:t>虐文之所以吸引你一直看下去，是因为你预感到情节可能会反转；暧昧之所以让人欲罢不能，是大脑将偶尔的一点甜头标记为特写镜头；分手后不断翻看聊天记录，是记忆总是试图在一堆碎片中，找到可以证明“他曾爱过”的证据。当情绪上头时，大脑不仅在感受，也在不断预测：他会不会回信？这份痛会有结果吗？这段感情还有机会吗？</w:t>
+      </w:r>
+    </w:p>
+    <w:p>
+      <w:pPr/>
+      <w:r>
+        <w:t>只要没有得出定论，注意力就会一直悬在那里，因为人很难轻松走出尚未结局的故事。</w:t>
+      </w:r>
+    </w:p>
+    <w:p>
+      <w:pPr/>
+      <w:r>
+        <w:t>虐恋情绪中的“心痛”不仅仅是一个形容词，被排斥、感觉羞辱或面临分离，都会引起真实的身体反应：胸口闷、胃里难受、喉咙堵塞、手心冷，甚至彻夜不眠、食不下咽。在神经科学研究中，专家会观察大脑中处理疼痛、威胁和情绪调节的区域，包括前扣带皮层、岛叶、杏仁核和前额叶。当大脑意识到“关系受损”的时候，它会调用身体处理疼痛和自我保护的资源。</w:t>
+      </w:r>
+    </w:p>
+    <w:p>
+      <w:pPr/>
+      <w:r>
+        <w:t>因此，你被拒绝时感到难受，部分原因是你的生理系统确实在报警。这种报警机制在进化过程中是有其意义的。人幼年期高度依赖照顾者，离开群体或亲密对象通常意味着死亡。所以，大脑非常认真地对待任何分离的信号。只是，这套警报系统在这个被社交媒体占据、信息随时可达的时代变得更容易被触发了。生理系统中“别丢下我”的本能恐惧，有时会扭曲为“他为什么不回我微信”的焦虑。</w:t>
+      </w:r>
+    </w:p>
+    <w:p>
+      <w:pPr/>
+      <w:r>
+        <w:t>虐恋剧情也借用了这套生理系统，当角色失去、误解、错过或牺牲的时候，观众同样能体会到一种分离的痛苦。我们在屏幕外并未真正失去什么，身体却不由自主地被卷了进去，于是我们会心跳加速、屏住呼吸、为之落泪甚至反复回看，因为这些故事真实地进入了你的情绪系统。大脑当然知道那是虚构的，但情绪反应并非全然由理性所支配。就像恐怖片里的鬼是假的，你的心跳照样会狂飙。理智知道是另一回事，要身体收回警报，平静下来，需要完全不同的过程。</w:t>
+      </w:r>
+    </w:p>
+    <w:p>
+      <w:pPr/>
+      <w:r>
+        <w:t>不过，情绪的痛感虽然会真实地作用于我们的身体，但我们不能过度受其影响。</w:t>
+      </w:r>
+    </w:p>
+    <w:p>
+      <w:pPr/>
+      <w:r>
+        <w:t>掌控这种情绪的第一步，是承认那种难受是真实存在的；第二步，看清楚它的深层来源：是剧情引发的共情，是关系中的不确定性，是旧伤疤被再次揭起，还是现实中真的遭受了伤害。</w:t>
+      </w:r>
+    </w:p>
+    <w:p>
+      <w:pPr/>
+      <w:r>
+        <w:t>与情绪痛感相对的“多巴胺”常常被人们视为快乐的象征。事实上，多巴胺负责的是期待、动机和学习。它是一个记录员，提示大脑哪些东西值得追求，哪些可能会带来回报，哪些信号意味着好事将至。人们喜欢甜蜜的感觉，但甜蜜到来之前的猜测与期待也十分有力。</w:t>
+      </w:r>
+    </w:p>
+    <w:p>
+      <w:pPr/>
+      <w:r>
+        <w:t>因此，最令人上头的是“可能”。如果对方的十次冷淡中夹杂了三两次温柔，你会死死记住那些温柔；如果剧情在五集误会后迎来了一个拥抱，评论区肯定会炸锅；一对没有官宣的CP同框时的一次对视，就能被剪辑成无数个版本。这背后的原理是“奖励预测”。大脑通过过去的经历预测回报，如果结果超出预期，奖励系统会高度激活；即便失望了，它还会继续找线索。</w:t>
+      </w:r>
+    </w:p>
+    <w:p>
+      <w:pPr/>
+      <w:r>
+        <w:t>一个平时冷漠的人突然的热情，对你的冲击力远远大于每天的问候；虐恋情节中，长期压抑后出现的一点点甜，也显得格外浓烈。因为高频波动容易吸引人注意。就像在短视频平台，下一条可能是精彩的也可能是平庸的，于是你一直下滑。抽卡游戏中，下次有可能中奖也有可能失败，于是你继续点。</w:t>
+      </w:r>
+    </w:p>
+    <w:p>
+      <w:pPr/>
+      <w:r>
+        <w:t>亲密关系一旦进入这种不稳定的节律，大脑就会容易将焦灼的等待解读为深情，将不安与焦虑解读为心动，将痛苦之后的暂时缓解解读为命中注定。许多人在分手之后最难以放下的，正是那种已成瘾的期待模式。手机屏幕一亮，身体先紧绷一下；对方的朋友圈一更新，大脑先猜测深意；共同朋友提到他的名字，情绪瞬间会波动。理智上知道你们已经结束了，但神经系统仍在原地等待下次回报的到来。</w:t>
+      </w:r>
+    </w:p>
+    <w:p>
+      <w:pPr/>
+      <w:r>
+        <w:t>因此，处理虐恋情绪的关键，是看懂这套机制如何在你身上运行：它在寻找信号、等待补偿、将偶然的一点甜头放大为某种深刻的含义。理解了这一点，才能在自动化的情绪反应中保持清醒。</w:t>
+      </w:r>
+    </w:p>
+    <w:p>
+      <w:pPr/>
+    </w:p>
+    <w:p>
+      <w:pPr>
+        <w:pStyle w:val="Heading2"/>
       </w:pPr>
       <w:r>
         <w:t>！！！第2章 CP为何好嗑</w:t>
@@ -1284,38 +2899,43 @@
     <w:p>
       <w:pPr>
         <w:pStyle w:val="Heading3"/>
-        <w:pageBreakBefore w:val="0"/>
       </w:pPr>
       <w:r>
         <w:t>@安全的冒险</w:t>
       </w:r>
     </w:p>
     <w:p>
+      <w:pPr/>
       <w:r>
         <w:t>嗑CP像是一种无须承担风险的情感冒险。</w:t>
       </w:r>
     </w:p>
     <w:p>
+      <w:pPr/>
       <w:r>
         <w:t>现实中的亲密关系是有成本的。表白可能被拒绝，恋爱需要磨合，分手会令人身心俱疲，如果到了谈婚论嫁的阶段，还要处理家庭、金钱和生活琐事。CP就像是一个情感安全屋：你可以在其中肆意挥洒情绪，也可以随时抽身而出。你不用承担关系后果，但可以真实感受到亲密关系带来的情绪波动。这也解释了为何当代疲惫的年轻人沉迷于嗑CP。它在某种程度上帮助人们宣泄了无处发泄的情绪，缓解了部分心理压力。最厉害的地方在于，某些剪辑、同人、二创能够在短短几分钟内浓缩现实中很难得到的即刻反馈。</w:t>
       </w:r>
     </w:p>
     <w:p>
+      <w:pPr/>
       <w:r>
         <w:t>CP不仅在电视剧里，综艺中的默契配合、小说中情感的脉络、体育赛场上的老搭档，甚至真实人物间的互动，都可以串联为一个感人的故事。大脑天生善于在碎片中找规律。谁无意中看谁一眼，谁自然接住谁一句话，谁在关键时刻坚定地站在谁一边，这些细节会被拼成一条完整的情感线。</w:t>
       </w:r>
     </w:p>
     <w:p>
+      <w:pPr/>
       <w:r>
         <w:t>对嗑CP敬而远之的人时常认为这就是过度脑补。有时确实如此。但脑补本身并不少见。我们平时理解别人，本来就需要通过表情、语气、动作和情境去猜测对方的心理。CP的独特性是，这样的猜测会带来一种“快乐共享”。一个眼神不再只是眼神，它成了评论区里心照不宣的暗号；一个简单的笑话，也可以成为很多人共同的情绪养分。</w:t>
       </w:r>
     </w:p>
     <w:p>
+      <w:pPr/>
       <w:r>
         <w:t>嗑CP的安全感源于距离。隔着一个屏幕，观众能自由决定投入程度：今天太累，看个甜的解解压；想发泄一下，就找点虐心的剧情看；不想看就关了手机。只要不至于严重妨碍现实生活，嗑CP可以是很好的情绪调剂、一个浪漫的想象游戏，甚至一种特殊的社交方式。</w:t>
       </w:r>
     </w:p>
     <w:p>
+      <w:pPr/>
       <w:r>
         <w:t>真正的问题出现在距离消失时。如果一个人开始以CP的方式要求现实生活中的另一半，或以现实生活中的占有欲对待虚构的角色与公众人物的人，情绪就会失衡。</w:t>
       </w:r>
@@ -1323,38 +2943,43 @@
     <w:p>
       <w:pPr>
         <w:pStyle w:val="Heading3"/>
-        <w:pageBreakBefore w:val="0"/>
       </w:pPr>
       <w:r>
         <w:t>@大脑在编剧</w:t>
       </w:r>
     </w:p>
     <w:p>
+      <w:pPr/>
       <w:r>
         <w:t>让人欲罢不能的CP，总会有恰到好处的留白，如果一个故事从头至尾清楚明白，毫无阐释空间，观众反而觉得乏味，没有参与的兴趣。引起反复讨论的，往往是没有说出来的潜台词、意味深长的沉默、镜头边缘捕捉到的小动作，或者剧情之外的无限可能。</w:t>
       </w:r>
     </w:p>
     <w:p>
+      <w:pPr/>
       <w:r>
         <w:t>大脑不喜欢混乱，但喜欢适度的不完整。正是这些空白，让想象得以发挥。一个普遍的心理学现象是，人们会自动补充不完整的信息。看到一个残缺的图形，我们会下意识地想象它完整的样子；听了一个说到关键处就停下的故事，我们会想象后续。如果一段关系只提供了些许线索，观众会以自己的经验和愿望来演绎。</w:t>
       </w:r>
     </w:p>
     <w:p>
+      <w:pPr/>
       <w:r>
         <w:t>嗑CP的过程，其实也是大脑在“编剧”。现实中，我们很少有机会重写人生剧本。错过就错过了，误会不一定说得清，喜欢的人不一定回应你，但是在CP世界中，观众可以通过剪辑、同人创作、评论和各种二创，为这段关系编织无限可能。遗憾是可以改写的，冷场有合理的解释，甚至沉默也可以翻译为深情。</w:t>
       </w:r>
     </w:p>
     <w:p>
+      <w:pPr/>
       <w:r>
         <w:t>想象力本身就是人处理情绪的一种本能。孩子玩“假装游戏”是练习面对恐惧和愿望，成人用小说、电影和音乐消化复杂的感觉，CP则像是互联网时代的一种新容器，将本来私密的想象变成了小范围的公共协作。</w:t>
       </w:r>
     </w:p>
     <w:p>
+      <w:pPr/>
       <w:r>
         <w:t>大脑在补全信息的时候，往往先套用自己的情绪模板。一个害怕被抛弃的人，很容易在关系中解读出冷淡；渴望拯救别人的人，容易迷上破碎感十足的角色；而长期得不到回应的人，可能会将对方的一点礼貌视为特殊信号。解读CP有时也是在读自己的过往经历。嗑CP在某种程度上同时投射了人的欲望与伤口。</w:t>
       </w:r>
     </w:p>
     <w:p>
+      <w:pPr/>
       <w:r>
         <w:t>如果一个人不断沉迷于“互相折磨才是深情”的故事中，也许可以问一问自己：我是不是在重演一种熟悉的痛苦？</w:t>
       </w:r>
@@ -1362,46 +2987,53 @@
     <w:p>
       <w:pPr>
         <w:pStyle w:val="Heading3"/>
-        <w:pageBreakBefore w:val="0"/>
       </w:pPr>
       <w:r>
         <w:t>@群体归属感</w:t>
       </w:r>
     </w:p>
     <w:p>
+      <w:pPr/>
       <w:r>
         <w:t>嗑CP最有趣的地方在于，它很少让人产生“孤独感”。评论区/弹幕/超话/群聊/剪辑标题/表情包，都会构成微小的社交系统。一个人说“这里眼神不对劲”，马上就会有人接话“我也发现了”；有人发了一张动图，就会有人就心领神会地加上台词，出处，时间线。</w:t>
       </w:r>
     </w:p>
     <w:p>
+      <w:pPr/>
       <w:r>
         <w:t>这极大地满足了人们那种“不是只有我”的被确认渴望。你的情绪会被别人认可，甚至连现实中不好说出口的细腻感受，同好圈都有相对应的语言。你觉得那一幕让人酸涩，别人也感同身受；你听出某句话有双关含义，别人也心照不宣；你为角色伤心，有几十个人陪你一起流泪，这种感受会放大并确认你的情绪体验。</w:t>
       </w:r>
     </w:p>
     <w:p>
+      <w:pPr/>
       <w:r>
         <w:t>这其实带来了一种社交奖励。被理解、被回应、被接住梗，都会有一种神奇的连接感。人在同好群里得到的快乐，不仅在于CP本身，更多来自“我们居然懂得同一个东西”。暗号越细致，越隐晦，归属感越强。外人看不明白的梗，圈里人一看就懂，这反而加强了群体的认同感。</w:t>
       </w:r>
     </w:p>
     <w:p>
+      <w:pPr/>
       <w:r>
         <w:t>互联网也使这种认同感触手可达，以前喜欢一部剧，可能只能跟身边几个朋友聊聊；现在情绪上头时，可以迅速在网络中找到共鸣。半夜睡不着，发个“谁懂这剧情”，下面会很快有百来条评论。孤独感被缓解了，你的感受在这里有了回响。</w:t>
       </w:r>
     </w:p>
     <w:p>
+      <w:pPr/>
       <w:r>
         <w:t>不过，这种回响也有副作用，当一个观点在圈子里被反复咀嚼，它听起来就会越来越像真理；当一种痛楚被不断赋予新的名号，人就越来越难从中抽身；而某种反应如果经由集体加工，个人慢慢会很难分辨出，什么是“我的真实感受”，什么是“大家希望我表现出来的感受”。有时你的内心并不太痛苦，但连续刷了几十条虐心的剪辑视频，情绪却被拉到了低处。</w:t>
       </w:r>
     </w:p>
     <w:p>
+      <w:pPr/>
       <w:r>
         <w:t>嗑CP原本应该是一种娱乐，但如果这过度影响你的情绪，甚至影响你的生活，那说明这种社交奖励已经跟焦虑绑在了一起。你可以问问自己：关掉网页后，生活有没有变得开阔一点？如果有，那CP就像一扇窗，为你展示一片风景；如果关了之后只会感到更加空虚、烦躁，甚至想找人吵架的话，它或许已经成了情绪陷阱。</w:t>
       </w:r>
+    </w:p>
+    <w:p>
+      <w:pPr/>
     </w:p>
     <w:p>
       <w:pPr>
         <w:pStyle w:val="Heading2"/>
-        <w:pageBreakBefore w:val="0"/>
       </w:pPr>
       <w:r>
         <w:t>！！！第3章 虐感的心理机制</w:t>
@@ -1410,43 +3042,49 @@
     <w:p>
       <w:pPr>
         <w:pStyle w:val="Heading3"/>
-        <w:pageBreakBefore w:val="0"/>
       </w:pPr>
       <w:r>
         <w:t>@间歇性回报</w:t>
       </w:r>
     </w:p>
     <w:p>
+      <w:pPr/>
       <w:r>
         <w:t>那些让人欲罢不能、反复拉扯的关系，有一个共同的特点：时常摇摆不定，其中偶有些许甜蜜。</w:t>
       </w:r>
     </w:p>
     <w:p>
+      <w:pPr/>
       <w:r>
         <w:t>对方不是全然冷淡，否则，人在完全得不到回应的情况下很容易离开。折磨人的恰恰在于你打算放弃时，他偏偏给你一点希望；你决定删掉她时，她又突然发来关心；你们吵得筋疲力尽时，得到了一个深情的拥抱。所以，你的大脑牢牢地记住了这一点甜蜜，并为此在煎熬时依旧等待下一颗糖。</w:t>
       </w:r>
     </w:p>
     <w:p>
+      <w:pPr/>
       <w:r>
         <w:t>这个机制在心理学中称为“间歇性强化”：你不是每一次都能得到奖励，奖励只是偶尔出现。</w:t>
       </w:r>
     </w:p>
     <w:p>
+      <w:pPr/>
       <w:r>
         <w:t>这种不确定性比起固定奖励更容易让人上瘾。你会不断尝试，期待下次可能会有结果。抽奖、刷短视频、追连载，背后的心理机制其实都关乎这种不确定性。而在亲密关系中，间歇性回报的力量十分惊人。因为这里的奖励不仅仅是物质或者一条信息，它还包含“被看到”、“被选择”和“被需要”的感受。</w:t>
       </w:r>
     </w:p>
     <w:p>
+      <w:pPr/>
       <w:r>
         <w:t>一个平时冷淡的人突然说一句“我想你”，会瞬间点燃你的整个情绪系统。你记得自己曾经因为等待和被忽略如何煎熬，但情绪确实会在这一刻上头。长此以往，这会带来一种根深蒂固的心理暗示：疼痛之后必定有补偿。只要补偿没有到来，你的注意力就很难彻底撤离。</w:t>
       </w:r>
     </w:p>
     <w:p>
+      <w:pPr/>
       <w:r>
         <w:t>更危险的是，间歇性回报仿佛有种“特别”感。稳定地回复你显得十分平淡，忽冷忽热则极有张力。人们常常会为少见的温柔赋予过多意义，甚至想用它来抵消长久的忽视、羞辱与失约。</w:t>
       </w:r>
     </w:p>
     <w:p>
+      <w:pPr/>
       <w:r>
         <w:t>但是，一次道歉无法抹去反复的伤害，一句想念也无法代替长期的尊重。如果你发现自己总是期待“下次他会变好”，可以尝试写一张对账单。左边记录让对方给予你安全感的行为，右边记录让你焦虑和受伤的行为。一段时间后，你就能看清这段关系的底色。</w:t>
       </w:r>
@@ -1454,33 +3092,37 @@
     <w:p>
       <w:pPr>
         <w:pStyle w:val="Heading3"/>
-        <w:pageBreakBefore w:val="0"/>
       </w:pPr>
       <w:r>
         <w:t>@未完待续感</w:t>
       </w:r>
     </w:p>
     <w:p>
+      <w:pPr/>
       <w:r>
         <w:t>我们总是对尚未完成的事情格外敏感。那些没说出口的话、没解释清楚的误会、没能正式告别的关系，或是没等到结局的剧集，就像悬在脑海里的待办事项，不时提醒你。你可能能照常工作、生活、社交，可注意力总会不时飘回去。这种感觉并不总是清晰的念头，有时是胸口莫名一紧，有时是忍不住想搜对方的动态，又或是突然循环某首承载共同记忆的歌。</w:t>
       </w:r>
     </w:p>
     <w:p>
+      <w:pPr/>
       <w:r>
         <w:t>这种“未完成感”其实一直在占用你的认知资源。大脑为了给下一步行动做准备，会固执地保留相关信息。当一段关系没有明确的终点时，大脑就很难将其“归档”。它会不停地追问：我是不是还得做点什么？还有转机吗？对方那句话到底什么意思？如果我当时换个说法，结局会不会不一样？</w:t>
       </w:r>
     </w:p>
     <w:p>
+      <w:pPr/>
       <w:r>
         <w:t>虐恋作品最擅长利用这种心理。编剧把真相藏在迷雾里，把告白一拖再拖，把重逢的关键时刻放到下一集。观众明知这是套路，却还是被牵着鼻子走。因为大脑天生喜欢“闭合”，越接近答案，你就越停不下来。本来打算睡觉了，却总觉得“再看一集就有结果了”，结果新的悬念在下一集接踵而至。</w:t>
       </w:r>
     </w:p>
     <w:p>
+      <w:pPr/>
       <w:r>
         <w:t>在现实的关系里，这种未完成感往往比明确的拒绝更伤人。被拒绝固然难过，但大脑得到了一个明确的答案。而那些含糊、暧昧、拉扯和反复消失，会让人困在无数种可能性中。你没法哀悼一段“好像还没结束”的关系，也没法全心投入新生活，因为心里那个旧窗口始终没有关闭。</w:t>
       </w:r>
     </w:p>
     <w:p>
+      <w:pPr/>
       <w:r>
         <w:t>如果不想再陷入这种感觉，可以给自己创造一个可执行的“关闭动作”，并不一定需要对方配合。因为有些人永远不会给你解释，有些道歉注定等不到，有些关系就是会一直不明不白。你可以试着写一封永远不寄出的信，列出那些得不到答案的问题；或者为这段关系设定一个停止追问的终止点；甚至可以用一句话帮大脑完成归档，比如：“没有清楚的回应，这本身就是一种回应。”这种动作让混乱的情绪有了一个容器。情绪虽然还会涌动，但至少不会再次无边际地扩散。</w:t>
       </w:r>
@@ -1488,51 +3130,59 @@
     <w:p>
       <w:pPr>
         <w:pStyle w:val="Heading3"/>
-        <w:pageBreakBefore w:val="0"/>
       </w:pPr>
       <w:r>
         <w:t>@记忆会加戏</w:t>
       </w:r>
     </w:p>
     <w:p>
+      <w:pPr/>
       <w:r>
         <w:t>分手或失联之后，人最习惯做的事就是“回头看”。聊天记录、照片、礼物、朋友圈截图，还有一起去过的小店，全都成了证据。但问题是，记忆并不是一段客观的监控录像，它更像是一个每次打开都会被重新编辑的文档。你当下的心情，决定了你会如何读取过去。</w:t>
       </w:r>
     </w:p>
     <w:p>
+      <w:pPr/>
       <w:r>
         <w:t>想念的时候，大脑会自动筛选出那些甜蜜的片段：他在雨里等你的样子，她记得你所有忌口的细节，那天两人笑到直不起腰的瞬间。而痛苦的时候，大脑又会集中播放那些伤人的画面：那句冰冷的话，那次无故的失约，还有那段漫长的沉默。这两种记忆或许都是真的，但它们都不完整。</w:t>
       </w:r>
     </w:p>
     <w:p>
+      <w:pPr/>
       <w:r>
         <w:t>虐恋的情绪最擅长在记忆里“加戏”。一个普通的细节，会被你解读成命中注定；一句模糊的表达，会被赋予深情厚谊；甚至一次伤害，在事后也会被美化成“他只是当时太痛苦”。当你的潜意识想要故事继续下去时，大脑总能帮你找到素材。记忆本就服务于当下的需求。当你动了离开的念头，记忆就会帮你搜集离开的借口；当你想要回头，记忆又会帮你翻找回头的理由。真正的难点在于，我们总以为自己在还原事实，其实是在参与一场即兴创作。</w:t>
       </w:r>
     </w:p>
     <w:p>
+      <w:pPr/>
       <w:r>
         <w:t>我们可以把内容拆成三层：发生了什么，我怎么解释，以及身体有什么反应。比如，“他三天没回消息”是事实；“他肯定不在乎我了”是解释；“我胸闷、失眠、想哭”则是反应。事实需要去核对，解释要留有余地，身体反应则需要被好好安抚。一旦这三者搅成一团，人就很容易被情绪牵着鼻子走。</w:t>
       </w:r>
     </w:p>
     <w:p>
+      <w:pPr/>
       <w:r>
         <w:t>看那些虐恋作品时也可以套用这个逻辑。角色做了什么，剧情给了什么线索，而我为什么会被这一幕击中？有时你会察觉，真正刺痛你的并非角色的命运，而是你再熟悉不过的经历：那些不敢开口的需求，那些等不到回应的煎熬，还有曾经没能说出口的告别。作品不过是恰好照亮了你心里的那个角落。</w:t>
       </w:r>
     </w:p>
     <w:p>
+      <w:pPr/>
       <w:r>
         <w:t>既然记忆会给自己加戏，我们也可以学着去剪辑，在回放时加入更多视角的镜头。甜蜜是真的，失望也是真的；心动有过，代价也付过；对方确实有他的好，但你的消耗也实实在在。</w:t>
       </w:r>
     </w:p>
     <w:p>
+      <w:pPr/>
       <w:r>
         <w:t>当故事不再只有单一的高光时刻，变成一条完整的时间线，情绪自然会慢慢降温。</w:t>
       </w:r>
+    </w:p>
+    <w:p>
+      <w:pPr/>
     </w:p>
     <w:p>
       <w:pPr>
         <w:pStyle w:val="Heading2"/>
-        <w:pageBreakBefore w:val="0"/>
       </w:pPr>
       <w:r>
         <w:t>！！！第4章 关系的勘察地图</w:t>
@@ -1541,38 +3191,43 @@
     <w:p>
       <w:pPr>
         <w:pStyle w:val="Heading3"/>
-        <w:pageBreakBefore w:val="0"/>
       </w:pPr>
       <w:r>
         <w:t>@警报系统</w:t>
       </w:r>
     </w:p>
     <w:p>
+      <w:pPr/>
       <w:r>
         <w:t>很多人觉得，亲密关系里的焦虑是因为自己想得太多。可实际上，在你开始“想”之前，身体往往已经先有了动作。消息没回，胃部先感到一阵沉重；看到对方上线，心跳不由自主地加快；听见熟悉的铃声，手指下意识地去摸手机；争吵才刚起头，肩膀就已经紧绷起来。</w:t>
       </w:r>
     </w:p>
     <w:p>
+      <w:pPr/>
       <w:r>
         <w:t>大脑的警报系统会飞快地判断环境是否安全，而亲密对象的态度，也被纳入了这份安全评估报告。我们常提到杏仁核，它负责检测威胁。虽然名字听起来像个小零件，功能却覆盖极广。它帮大脑识别危险信号，让身体进入防御状态。对有些人来说，伴侣的沉默、语气的微调，甚至已读不回，都会被识别为威胁。</w:t>
       </w:r>
     </w:p>
     <w:p>
+      <w:pPr/>
       <w:r>
         <w:t>身体分不清什么是“真实的危险”，什么是“像过去的危险”，它只知道现在必须保持警觉。一旦警报系统拉响，理性的空间就会被挤压。人会变得更容易捕捉负面信息，更急于寻求确认，更无法耐心地等待。你心里明明清楚半小时不回消息很正常，可身体已经进入了紧急状态。这时候再去分析“他到底爱不爱我”，通常只会越想越乱，因为这种分析本身就在给警报系统添柴火。</w:t>
       </w:r>
     </w:p>
     <w:p>
+      <w:pPr/>
       <w:r>
         <w:t>虐恋剧情之所以让人上头，也跟这套警报系统有关。危险、分离、误会、牺牲，这些元素都会提高人的唤醒水平。所谓唤醒，就是身体被激活的状态，伴随着心跳、呼吸、注意力和肌肉紧张的变化。高唤醒会让体验变得异常强烈，所以剧情里的一句告白如果发生在生死关头，观众会觉得格外震撼；现实中一个拥抱如果发生在激烈争吵之后，也会让人感到刻骨铭心。</w:t>
       </w:r>
     </w:p>
     <w:p>
+      <w:pPr/>
       <w:r>
         <w:t>问题在于，高唤醒的状态并不等同于高质量的亲密。吵架后的和好固然热烈，但这并不能证明关系本身是健康的。久别重逢的拥抱确实动人，却无法替代日常相处中的尊重。当警报解除的那一刻，身体会产生巨大的松弛感，我们很容易把这种“如释重负”误认为幸福。其实，那有时仅仅是从极度紧张回到了暂时的不紧张而已。</w:t>
       </w:r>
     </w:p>
     <w:p>
+      <w:pPr/>
       <w:r>
         <w:t>观察一段关系时，不妨试着问自己三个问题，我和这个人在一起时，身体更多是感到舒展还是紧绷？我表达出自己的需求后，得到的是理解还是惩罚？当我离开对方一小段时间，我的生活是会恢复常态还是彻底崩塌？这些问题能帮你绕开“他到底爱不爱我”这种逻辑迷宫，直接看清安全感的真实质量。</w:t>
       </w:r>
@@ -1580,38 +3235,43 @@
     <w:p>
       <w:pPr>
         <w:pStyle w:val="Heading3"/>
-        <w:pageBreakBefore w:val="0"/>
       </w:pPr>
       <w:r>
         <w:t>@奖励回路</w:t>
       </w:r>
     </w:p>
     <w:p>
+      <w:pPr/>
       <w:r>
         <w:t>人们对于会带来快乐、希望、亲近、自我价值感的线索十分敏感。喜欢的人的一个眼神、对话框跳出的一条信息、喜欢的CP的一次偶遇，都会成为大脑奖励系统的信号。</w:t>
       </w:r>
     </w:p>
     <w:p>
+      <w:pPr/>
       <w:r>
         <w:t>在大脑中，纹状体等部位负责加工奖励，而前额叶负责计划、抑制与判断，可以简单理解为一个系统会让你“快去追”，一个系统则要求“等等，看看代价”。人在情绪激动、睡眠不足或压力很大时，“刹车”功能会减弱，这时你会更容易冲动地发信息、机械地刷视频，或熬夜不停追剧。</w:t>
       </w:r>
     </w:p>
     <w:p>
+      <w:pPr/>
       <w:r>
         <w:t>所以，很多失控都发生于深夜。白天你要保持体面，但晚上，疲惫与孤独在寂静中交织，前额叶像一个加班过度的管理者，终于支撑不住。这时，奖励的线索更吸引人了，你更容易翻看从前的聊天记录，更容易不停点击虐心剪辑，因为大脑的调节资源捉襟见肘。</w:t>
       </w:r>
     </w:p>
     <w:p>
+      <w:pPr/>
       <w:r>
         <w:t>奖励回路还有一个特点：它“认路”。如果每次难过都去看对方的动态，每次焦虑都去搜CP物料，每次孤独都去看虐文，时间一长，大脑会形成固定的回路。情绪一旦出现，身体会自动走那个熟悉的出口。这种短期宣泄情绪的方式，会慢慢成为依赖路径。</w:t>
       </w:r>
     </w:p>
     <w:p>
+      <w:pPr/>
       <w:r>
         <w:t>想要改变这种依赖路径，单靠“禁止”往往效果不大，大脑和身体需要新的奖励。可以准备一些“替代性奖励”。例如，想刷对方动态就先去洗个热水澡，想发小作文就先给朋友发一段语音，想熬夜追虐剧就看一集低刺激的，想翻老照片就干脆出门走十分钟。这些替代品未必会带来同样的刺激，但能帮你在情绪上头的当下避免冲动地重蹈覆辙。</w:t>
       </w:r>
     </w:p>
     <w:p>
+      <w:pPr/>
       <w:r>
         <w:t>奖励系统激励人们追求连接、艺术、爱和希望，它支撑着我们努力生活。真正需要调整的是奖励的来源。如果所有奖励都集中于一个人或一段关系上，情绪与生活很容易失控。奖励来源越多，单一刺激的控制力就越小。</w:t>
       </w:r>
@@ -1619,51 +3279,59 @@
     <w:p>
       <w:pPr>
         <w:pStyle w:val="Heading3"/>
-        <w:pageBreakBefore w:val="0"/>
       </w:pPr>
       <w:r>
         <w:t>@身体账本</w:t>
       </w:r>
     </w:p>
     <w:p>
+      <w:pPr/>
       <w:r>
         <w:t>身体和情绪一样，都会记账。</w:t>
       </w:r>
     </w:p>
     <w:p>
+      <w:pPr/>
       <w:r>
         <w:t>一段关系是否在消耗你，取决于它长期给你留下的是什么，睡眠变浅、食欲紊乱、注意力不集中、反复头痛、胃部不适、月经不调，甚至工作效率直线下降……这些都是压力在对你发出警报。</w:t>
       </w:r>
     </w:p>
     <w:p>
+      <w:pPr/>
       <w:r>
         <w:t>尽管这些问题未必全都源于感情，但我们可以将它们并列审视。虐恋带来的情绪波动最容易使人算不清“身体账单”。由于情绪的冲击太大，人容易陷在“他到底是怎么想的”、“还能不能和好”、“我还要不要坚持一下”的纠结中，而很少回头看自己究竟付出了多大的生理代价。尤其是经常通过熬夜获得情绪刺激的人，第二天的疲倦会使情绪调节能力下降，晚上反而更加渴望寻求刺激，就这样陷入一种恶性循环。</w:t>
       </w:r>
     </w:p>
     <w:p>
+      <w:pPr/>
       <w:r>
         <w:t>我们观察身体账本，是因为身体不会被浪漫的语言欺骗。如果一个人嘴上说爱你，却让你长期生活在恐惧中；如果一段关系有时甜蜜，但你越来越迷茫焦虑，身体都会以负面反应来告诉你：这笔关系账已经超支了。</w:t>
       </w:r>
     </w:p>
     <w:p>
+      <w:pPr/>
       <w:r>
         <w:t>我们可以尝试做一个简单的记录，为期一个月，每天只写四项：睡眠时间、进食量、情绪强度、接触刺激的时间。这里的“刺激”可以是对方的消息、社交动态，也可以是虐恋视频，CP材料。</w:t>
       </w:r>
     </w:p>
     <w:p>
+      <w:pPr/>
       <w:r>
         <w:t>记录时不进行任何评价，只观察其间的联系。一个月后，甚至或许半个月内，你就能发现一些规律：每次晚上看什么，第二天情绪就低落；每次和某人聊完天，身体会紧绷好几个小时；而每次出门锻炼或者见见朋友，这种想要刷手机的冲动反而减少了。</w:t>
       </w:r>
     </w:p>
     <w:p>
+      <w:pPr/>
       <w:r>
         <w:t>这些发现是你的身体切实的反应，它比任何道理更近地触及你。因此，身体账本不会要求你爱谁、离开谁、看什么或者不看什么，它只会告诉你事实：什么在给你充能，什么在消耗你。</w:t>
       </w:r>
+    </w:p>
+    <w:p>
+      <w:pPr/>
     </w:p>
     <w:p>
       <w:pPr>
         <w:pStyle w:val="Heading2"/>
-        <w:pageBreakBefore w:val="0"/>
       </w:pPr>
       <w:r>
         <w:t>！！！第5章 看清虐恋</w:t>
@@ -1672,33 +3340,37 @@
     <w:p>
       <w:pPr>
         <w:pStyle w:val="Heading3"/>
-        <w:pageBreakBefore w:val="0"/>
       </w:pPr>
       <w:r>
         <w:t>@剧情与现实</w:t>
       </w:r>
     </w:p>
     <w:p>
+      <w:pPr/>
       <w:r>
         <w:t>喜欢看虐恋剧，不代表一个人真想在现实里受伤，很多人追虐文，只是为了在安全距离外感受强烈的情绪起伏。进入虚构故事有暂停和开始键，有弹幕陪伴，有大结局或者同人创作，还有“这只是虚构”的保护罩。但现实中并没有这样的保护措施。</w:t>
       </w:r>
     </w:p>
     <w:p>
+      <w:pPr/>
       <w:r>
         <w:t>剧情中的痛苦往往为了故事而存在，误解终会被解开，牺牲终会被看见，沉默总是有苦衷，冷漠的背后也有深情。观众之所以能忍受这份痛，是相信痛苦终将走向某种意义。可是现实中，沉默也许只是逃避，冷漠也许是看不起，伤害不一定有原因，长久的等待也不一定会带来成长。</w:t>
       </w:r>
     </w:p>
     <w:p>
+      <w:pPr/>
       <w:r>
         <w:t>看别人的故事和过自己的生活，需要不同的标准。看剧的时候，你大可以为角色的极端选择流泪；但是回到现实中，你要看一个人是否尊重你的时间、边界和感受。嗑CP的时候，你可以尽情享受那种拉扯感和张力；但现实中的亲密关系里，你要判断对方愿不愿意沟通，是否稳定，你能否在关系中做自己。虚构作品追求戏剧性，但现实关系要求可生活性。</w:t>
       </w:r>
     </w:p>
     <w:p>
+      <w:pPr/>
       <w:r>
         <w:t>有些人喜欢用“虐”作为爱的证明，好像疼得越厉害就代表爱得就越深，困难的过程也意味着更真实的感情。这样的想法像是为痛苦加冕，让人认为难过有价值，或许能带来一些心理安慰。但是，在更广泛的情况下，关系的价值不应该只用痛苦去衡量。真正滋养你的是细水长流的稳定日常：发出去的信息有回应，承诺会被兑现，吵架后能以成熟的方式和好，脆弱的时候有人支持，底线得到尊重。</w:t>
       </w:r>
     </w:p>
     <w:p>
+      <w:pPr/>
       <w:r>
         <w:t>或许我们可以尝试关掉背景音乐，去掉慢镜头，摆脱“宿命感”以及旁观者的评论，只看行为本身，剥离了滤镜后，这段关系还剩下什么？褪去戏剧性，你看到的才是真相。</w:t>
       </w:r>
@@ -1706,33 +3378,37 @@
     <w:p>
       <w:pPr>
         <w:pStyle w:val="Heading3"/>
-        <w:pageBreakBefore w:val="0"/>
       </w:pPr>
       <w:r>
         <w:t>@浪漫化的风险</w:t>
       </w:r>
     </w:p>
     <w:p>
+      <w:pPr/>
       <w:r>
         <w:t>深情的外衣往往被用来美化伤害。有人把控制说成在乎，把嫉妒解释成爱得太深，冷暴力被洗白为“不善表达”，反复失约被解释为“身不由己”，甚至羞辱和贬低都可以被美化为“刀子嘴豆腐心”。这些理由在剧本中可以制造张力，在现实中却会让你渐渐对伤害感到麻木。</w:t>
       </w:r>
     </w:p>
     <w:p>
+      <w:pPr/>
       <w:r>
         <w:t>把痛苦浪漫化，会渐渐侵蚀你的底线。第一次被冷落时，你还觉得难受；第二次，你就开始主动帮对方找借口；到第三次，你甚至开始从自身找原因。时间长了，你的感情需求会渐渐萎缩，仿佛对方回复一条信息就是好的，对方道歉就是对感情的救赎。这其实是一种扭曲失衡的状态。</w:t>
       </w:r>
     </w:p>
     <w:p>
+      <w:pPr/>
       <w:r>
         <w:t>另一种常见的浪漫化是“拯救者幻想”。你认为自己是最了解他的；只有你能治愈对方的创伤；只要足够耐心，对方总会变得更好。这种想法看似深情，还会让人生出成就感，实际上会让人无比疲惫，甚至可能导致自我矮化及工具化。</w:t>
       </w:r>
     </w:p>
     <w:p>
+      <w:pPr/>
       <w:r>
         <w:t>亲密关系的确需要相互支持，但是你不能为另一个人承担他生命中的所有修复工作。一个人是否愿意面对问题，是否愿意改变，不应以你的牺牲来交换。尤其需要警惕爱与恐惧交杂的关系。如果你不敢表达不满，怕对方生气，怕被冷战惩罚，甚至怕对方以自身状态威胁，那么，你需要审视自己在关系中究竟背负着什么。</w:t>
       </w:r>
     </w:p>
     <w:p>
+      <w:pPr/>
       <w:r>
         <w:t>只有在边界清晰的前提下互相靠近，生活才有继续的可能；如果靠近需要丢弃尊严、牺牲睡眠，甚至放弃工作和朋友，这些不是深情的代价，是危险的信号。</w:t>
       </w:r>
@@ -1740,71 +3416,83 @@
     <w:p>
       <w:pPr>
         <w:pStyle w:val="Heading3"/>
-        <w:pageBreakBefore w:val="0"/>
       </w:pPr>
       <w:r>
         <w:t>@边界的信号</w:t>
       </w:r>
     </w:p>
     <w:p>
+      <w:pPr/>
       <w:r>
         <w:t>边界是一个人清楚自己的底线在哪里，知道什么能接受、什么不能接受，并且在对方越界时，知道自己该采取什么行动。</w:t>
       </w:r>
     </w:p>
     <w:p>
+      <w:pPr/>
       <w:r>
         <w:t>很多人在虐恋的泥潭里丢掉底线，往往是从一些不起眼的小事开始的。对方临时放了你鸽子，你大方地说没关系；对方连着几天玩消失，你替他找借口说太忙；对方开了个伤人的玩笑，你反思是不是自己太敏感；对方要求你随叫随到，你觉得爱一个人就该多体谅。每一次退让看着都不痛不痒，可加在一起，你生活的重心就这么悄悄偏了。</w:t>
       </w:r>
     </w:p>
     <w:p>
+      <w:pPr/>
       <w:r>
         <w:t>想知道自己的边界是不是正在被蚕食，可以留意这五个信号。</w:t>
       </w:r>
     </w:p>
     <w:p>
+      <w:pPr/>
       <w:r>
         <w:t>第一，你变得越来越不敢表达真实感受。开口前总要先盘算：他会不会烦？会不会直接消失？</w:t>
       </w:r>
     </w:p>
     <w:p>
+      <w:pPr/>
       <w:r>
         <w:t>第二，你的生活节奏完全围着对方转。不管是睡觉、工作，还是社交和爱好，随时都能为他让路。</w:t>
       </w:r>
     </w:p>
     <w:p>
+      <w:pPr/>
       <w:r>
         <w:t>第三，你开始对身边的人隐瞒感情细节。你心里清楚，朋友听完肯定会劝你分手，而你害怕听到那个真相。</w:t>
       </w:r>
     </w:p>
     <w:p>
+      <w:pPr/>
       <w:r>
         <w:t>第四，你的自我评价跌到了谷底。你经常觉得自己不够好、不够懂事，甚至觉得自己不配得到一份稳定的感情。</w:t>
       </w:r>
     </w:p>
     <w:p>
+      <w:pPr/>
       <w:r>
         <w:t>第五，当你提出最基本的需求时，对方给出的不是解决办法，反而是冷淡、嘲讽、威胁，或者干脆转移话题。</w:t>
       </w:r>
     </w:p>
     <w:p>
+      <w:pPr/>
       <w:r>
         <w:t>建立边界，最好从具体的行为准则开始，而不是空洞的指责，比如你可以说：“如果临时取消约会，请提前告诉我”；“我不能接受吵架时的人身攻击”；“我每周需要有属于自己的时间”。</w:t>
       </w:r>
     </w:p>
     <w:p>
+      <w:pPr/>
       <w:r>
         <w:t>边界必须配合行动。如果你嘴上说着不能接受，行动上却一次次妥协，那么你的大脑和对方都会接收到相反的信号。</w:t>
       </w:r>
     </w:p>
     <w:p>
+      <w:pPr/>
       <w:r>
         <w:t>这件事做起来确实难，尤其是对于那些容易焦虑、缺乏安全感的人来说，立规矩会带来巨大的恐惧：万一对方因此走了怎么办？但边界本身就是一种筛选。愿意尊重你边界的人，才值得一起磨合；而那些只要你一立边界就想逃跑的人，或许原本就只打算留在你的失控里。</w:t>
       </w:r>
+    </w:p>
+    <w:p>
+      <w:pPr/>
     </w:p>
     <w:p>
       <w:pPr>
         <w:pStyle w:val="Heading2"/>
-        <w:pageBreakBefore w:val="0"/>
       </w:pPr>
       <w:r>
         <w:t>！！！第6章 情绪急救</w:t>
@@ -1813,43 +3501,49 @@
     <w:p>
       <w:pPr>
         <w:pStyle w:val="Heading3"/>
-        <w:pageBreakBefore w:val="0"/>
       </w:pPr>
       <w:r>
         <w:t>@命名此刻</w:t>
       </w:r>
     </w:p>
     <w:p>
+      <w:pPr/>
       <w:r>
         <w:t>当情绪排山倒海袭来时，许多人往往只有一个念头：“我真的忍不住了。”</w:t>
       </w:r>
     </w:p>
     <w:p>
+      <w:pPr/>
       <w:r>
         <w:t>这是一种真实的感受，但它太笼统了，它将焦虑、愤怒、羞耻、嫉妒、想念、失望和孤独交织成一团迷雾。大脑面对一团迷雾时往往束手无策，只有面对被清晰定义的状态，它才有机会处理。</w:t>
       </w:r>
     </w:p>
     <w:p>
+      <w:pPr/>
       <w:r>
         <w:t>“情绪命名”是一种简单却十分有效的调节手段。就是用具体的词说出当下的感受。</w:t>
       </w:r>
     </w:p>
     <w:p>
+      <w:pPr/>
       <w:r>
         <w:t>比如你可以告诉自己：“我现在只是在焦虑，并不是真的有坏事要发生”；“我现在是产生了嫉妒心，而不是事实如此”；“我现在这种难受是戒断反应，不代表我必须联系他”。</w:t>
       </w:r>
     </w:p>
     <w:p>
+      <w:pPr/>
       <w:r>
         <w:t>命名之所以有效，是因为它能调动前额叶参与你当下的状态。当前额叶开始组织语言时，情绪系统就会降温。即便温度只降下来一点，你可能就不会发那条让自己后悔的信息，不会刷手机到凌晨三点。</w:t>
       </w:r>
     </w:p>
     <w:p>
+      <w:pPr/>
       <w:r>
         <w:t>建议你在手机备忘录里存一张“情绪词表”。每当情绪上头、心里乱成一团时，先试着从词表里挑出三个词：是焦虑、委屈、愤怒？还是想念、羞耻、害怕？或者是空虚、嫉妒、不甘？选好后，再给它补上一个触发源，比如“因为他没回我消息”。最后，留意一下身体的反应，是“胸口发紧”、“胃里难受”还是“手在发抖”。</w:t>
       </w:r>
     </w:p>
     <w:p>
+      <w:pPr/>
       <w:r>
         <w:t>这个简单的过程能够将你从“宿命感”中拉回现实。宿命感会让你觉得“我这辈子可能必须与他纠缠，我根本离不开他”；而描述却会告诉你，“现在是晚上十一点，由于没有得到回复，我的焦虑值达到了八分”。后者更具体，也更容易处理。</w:t>
       </w:r>
@@ -1857,33 +3551,37 @@
     <w:p>
       <w:pPr>
         <w:pStyle w:val="Heading3"/>
-        <w:pageBreakBefore w:val="0"/>
       </w:pPr>
       <w:r>
         <w:t>@降低生理唤醒</w:t>
       </w:r>
     </w:p>
     <w:p>
+      <w:pPr/>
       <w:r>
         <w:t>情绪上头时，身体处于警报状态，道理往往是无用的。你首先需要降低生理唤醒。身体平静下来，大脑才能够重新思考。从呼吸、肌肉和感官入手，都能够调整身体的状态，达到降低唤醒的效果。</w:t>
       </w:r>
     </w:p>
     <w:p>
+      <w:pPr/>
       <w:r>
         <w:t>控制呼吸节奏比较普遍的方式是延长呼气。不需要刻意深呼吸，关键是慢慢呼气，使呼气时间大于吸气时间。譬如你可以吸气数4拍，呼气数6拍，反复几分钟。这种深呼吸是告诉身体：现在是安全的，不必战斗或逃跑。</w:t>
       </w:r>
     </w:p>
     <w:p>
+      <w:pPr/>
       <w:r>
         <w:t>至于调节感官的方式，有的人喜欢数拍子，有的人喜欢听白噪音，有的人喜欢把手放肚子上感觉起伏，这些都可以令人放松。另外，用冷水洗脸、握紧冰凉的杯子、双脚用力踏地或慢慢地环顾房间，这种切实的感官触感可以将你拉回现实。焦虑总是望向未来，后悔则总是抓紧过去，但是身体活在现在。真实的感官触觉就是为了给予大脑安全反馈。</w:t>
       </w:r>
     </w:p>
     <w:p>
+      <w:pPr/>
       <w:r>
         <w:t>行动则是有效调动肌肉的方式。情绪上头时，出门散步十分钟，整理一下凌乱的桌面，洗个热水澡或做做拉伸，都能让情绪能量获得一个出口。事实上，大部分情况下，人越是僵住不动，情绪就越容易堆积。</w:t>
       </w:r>
     </w:p>
     <w:p>
+      <w:pPr/>
       <w:r>
         <w:t>需要注意的是，降低唤醒不是压抑情绪，压抑是强迫自己“不准难过”，降低唤醒是温和地告知身体“先别激动，我们放慢点”。我们允许自己难过，但不能在情绪上头时让它为你做决定。</w:t>
       </w:r>
@@ -1891,46 +3589,53 @@
     <w:p>
       <w:pPr>
         <w:pStyle w:val="Heading3"/>
-        <w:pageBreakBefore w:val="0"/>
       </w:pPr>
       <w:r>
         <w:t>@延迟冲动</w:t>
       </w:r>
     </w:p>
     <w:p>
+      <w:pPr/>
       <w:r>
         <w:t>人在上头的时候，最想做的事往往非常具体：发长难句消息、夺命连环call、疯狂翻看对方动态、拉黑删好友、求复合、找人摊牌，或者是报复性刷剧、冲进评论区跟人吵架。这些行为都有一个共同点：能让你获得即时的宣泄感。但立刻缓解压力并不代表长期有益。</w:t>
       </w:r>
     </w:p>
     <w:p>
+      <w:pPr/>
       <w:r>
         <w:t>人生中绝大多数的后悔，都发生在情绪登顶的那十几分钟里。所谓延迟冲动，就是试着在“想做某事”和“真的去做”之间，强行塞进一段缓冲的时间。你可以给自己定一个“二十分钟规则”。每当那股想联系对方的冲动涌上来时，先定个二十分钟的闹钟。</w:t>
       </w:r>
     </w:p>
     <w:p>
+      <w:pPr/>
       <w:r>
         <w:t>在这段时间里，你可以尽情地想他，允许自己哭一场，甚至可以把想说的话写成草稿，但唯独不能点发送。你要知道，很多冲动就像海浪，刚打过来时势头最猛，等一会儿自然就退下去了。你没必要去对抗整片大海，只要咬牙撑过这第一波浪头就好。</w:t>
       </w:r>
     </w:p>
     <w:p>
+      <w:pPr/>
       <w:r>
         <w:t>写草稿是排解联系冲动的好办法。把心里那些弯弯绕绕的话全写下来，越直白越好，只是别发出去。写完后，试着把句子分成三类：事实、需求和攻击。比如，“我们约好的时间你没来”是事实；“我希望你能提前告诉我”是需求；而“你从来都不在乎我”就是攻击。如果这条信息非发不可，那就尽量留下事实和需求，把攻击的话删掉。</w:t>
       </w:r>
     </w:p>
     <w:p>
+      <w:pPr/>
       <w:r>
         <w:t>对于那些让人上头的CP或虐恋内容，也要学会控制“情绪剂量”。比如，工作日睡前别看长篇虐文、别刷高强度的剪辑。看完虐心的东西后，记得给自己找个“现实锚点”：去喝口水、洗把脸、收拾下包，或者看看窗外。</w:t>
       </w:r>
     </w:p>
     <w:p>
+      <w:pPr/>
       <w:r>
         <w:t>情绪有入口，就需要有出口。如果只有入口没有出口，你很容易在别人的故事里迷失了自己。</w:t>
       </w:r>
+    </w:p>
+    <w:p>
+      <w:pPr/>
     </w:p>
     <w:p>
       <w:pPr>
         <w:pStyle w:val="Heading2"/>
-        <w:pageBreakBefore w:val="0"/>
       </w:pPr>
       <w:r>
         <w:t>！！！第7章 修复自我</w:t>
@@ -1939,53 +3644,61 @@
     <w:p>
       <w:pPr>
         <w:pStyle w:val="Heading3"/>
-        <w:pageBreakBefore w:val="0"/>
       </w:pPr>
       <w:r>
         <w:t>@关注自己</w:t>
       </w:r>
     </w:p>
     <w:p>
+      <w:pPr/>
       <w:r>
         <w:t>人在陷入虐恋情绪时，注意力会本能地聚焦于对方身上，但这时候最该做的，是关注自己。</w:t>
       </w:r>
     </w:p>
     <w:p>
+      <w:pPr/>
       <w:r>
         <w:t>譬如，在你想联系他的时候，先列一张清单，关注自己的真实需求。清单分三栏：我想联系他的理由、我真正需要的东西，以及除了联系他，还有谁或什么能帮到我。</w:t>
       </w:r>
     </w:p>
     <w:p>
+      <w:pPr/>
       <w:r>
         <w:t>我们常以为自己非那个人不可，其实我们的感觉中还掺杂着对安全感、价值感、归属感的需求，甚至是寻求刺激和习惯使然。一旦看清需求，你的选择就多了。你依然可以联系他，但那不再是你唯一的救命稻草。</w:t>
       </w:r>
     </w:p>
     <w:p>
+      <w:pPr/>
       <w:r>
         <w:t>如果你觉得确实有必要和对方沟通，在找他前先写下你的目标。你是想确认关系，还是想表达感受，或者是为了解决某个具体问题？目标越清晰，你就越不容易被对方的反应带偏。</w:t>
       </w:r>
     </w:p>
     <w:p>
+      <w:pPr/>
       <w:r>
         <w:t>感情中有一些拉扯是因为双方的沟通无效，每次想沟通一个小问题，最后却往往绕进了“谁更委屈、谁更爱、谁亏欠谁”的死胡同。沟通的时候，尽量把话落到具体的时间和行为上。比如，不要抱怨“你总是这样”，尝试表达“这周你三次临时取消了约会，我有点失落，希望以后咱们能提前沟通”。这样说，事情才更容易解决。</w:t>
       </w:r>
     </w:p>
     <w:p>
+      <w:pPr/>
       <w:r>
         <w:t>同样，看对方的回应也要看他的实际行动，不能只听情绪化的表白。一个真心想走下去的人，会跟你讨论以后该怎么做；而那些只想敷衍的人，无论当下说得多好听，事后往往没有多大变化。</w:t>
       </w:r>
     </w:p>
     <w:p>
+      <w:pPr/>
       <w:r>
         <w:t>列这个清单还有一个作用：你可以看清自己在整体人际关系中的处境。如果发现自己的所有情感需求只能寄托在一个人身上，这是很危险的事情。情绪世界不应该只有一个出口，朋友、家人、同事以及兴趣爱好都可以是你的生活支点。只要有足够的支点，即使某一段关系让你痛苦，也不至于动摇你的整个生活。</w:t>
       </w:r>
     </w:p>
     <w:p>
+      <w:pPr/>
       <w:r>
         <w:t>因此，如果发现你的支点不够多，需要建立自己的支持网络，帮你找回参照物，让你看到世界不止那一个角落。支持网络不需要多庞大，有两三个靠得住的朋友往往就够了。关键是，他们能听你讲真话，不让你感到羞耻，也不会只给你下命令。好的支持是帮你回归事实：他到底做了什么？你现在安全吗？你需要什么帮助？</w:t>
       </w:r>
     </w:p>
     <w:p>
+      <w:pPr/>
       <w:r>
         <w:t>我们是社会动物，会被关系刺痛，也会在关系里愈合，一个可靠的朋友、一次认真的聆听，都会教你神经系统重新获得安全感。</w:t>
       </w:r>
@@ -1993,43 +3706,49 @@
     <w:p>
       <w:pPr>
         <w:pStyle w:val="Heading3"/>
-        <w:pageBreakBefore w:val="0"/>
       </w:pPr>
       <w:r>
         <w:t>@叙事换轨</w:t>
       </w:r>
     </w:p>
     <w:p>
+      <w:pPr/>
       <w:r>
         <w:t>我们其实生活在自己写就的故事里，一段关系结束后，你如何解释这些事实决定了你的感受。</w:t>
       </w:r>
     </w:p>
     <w:p>
+      <w:pPr/>
       <w:r>
         <w:t>“我被甩了，说明我不值得被爱。”“他们闹得那么凶还没分开，看来痛苦才是真爱的底色。”“如果当初我表现得再好一点，他或许就会为我改变。”这些念头一旦在脑子里扎根，就会源源不断地制造痛苦。</w:t>
       </w:r>
     </w:p>
     <w:p>
+      <w:pPr/>
       <w:r>
         <w:t>所谓“叙事换轨”，就是给同样的事实换一种更完整、更不伤人的说法。这是拒绝让某一种偏激的解释霸占生活的全部真相。</w:t>
       </w:r>
     </w:p>
     <w:p>
+      <w:pPr/>
       <w:r>
         <w:t>比如，如果你以前认为“他忽冷忽热，是因为我不够优秀”，现在可以试着换成“他忽冷忽热让我感到很焦虑，但我的个人价值不该由他回消息的频率决定”。再比如，“我还想他，说明我根本离不开他”，可以换成“我还想他，说明我的情感依恋还没完全冷却；这是一种正常的生理反应，并不代表我必须去找他”。</w:t>
       </w:r>
     </w:p>
     <w:p>
+      <w:pPr/>
       <w:r>
         <w:t>成功换轨最有效的办法就是把弄丢的“主语”找回来。在那些虐心的情绪里，我们脑子里全是对方：他怎么想的，她为什么要这么做。换轨的时候，你要强行把“我”放回句子里：我需要什么，我能承受多少，我的身体现在有什么反应，我接下来打算做什么。</w:t>
       </w:r>
     </w:p>
     <w:p>
+      <w:pPr/>
       <w:r>
         <w:t>另外，还要学会加入“时间”这个维度。人在上头的时候总会夸大情绪的真正效应，你说“我永远也走不出来了”，大脑会默默记住你的感受。一旦加入时间，事情就变成了“今天晚上我很想联系他”。时间让问题变得有限，只要是有限的东西，就有处理和转圜的空间。</w:t>
       </w:r>
     </w:p>
     <w:p>
+      <w:pPr/>
       <w:r>
         <w:t>叙事换轨不需要一步到位。旧的故事你可能已经讲了很多年，刚开始讲新故事肯定会觉得僵硬。你可以慢慢对自己重新叙述，哪怕一开始心里不怎么相信也没关系。大脑需要重复学习。每当旧的念头冲上来时，你就为自己补上一句新的叙事。</w:t>
       </w:r>
@@ -2037,48 +3756,55 @@
     <w:p>
       <w:pPr>
         <w:pStyle w:val="Heading3"/>
-        <w:pageBreakBefore w:val="0"/>
       </w:pPr>
       <w:r>
         <w:t>@情绪反扑</w:t>
       </w:r>
     </w:p>
     <w:p>
+      <w:pPr/>
       <w:r>
         <w:t>情绪的消退总有反复。你可能以为自己已经走出来了，结果某天听到一首歌还是会破防；你已经很久没去搜对方的动态，却在生日那天突然心痒难耐；你答应自己不再熬夜看那些虐心的剧，但还是在压力巨大的晚上刷到凌晨。</w:t>
       </w:r>
     </w:p>
     <w:p>
+      <w:pPr/>
       <w:r>
         <w:t>这种“情绪反扑”并不说明你失败了，它只是大脑中的旧通道偶然又亮了一次。大脑对熟悉的通道很敏感，某个时间、地点、气味、音乐、节日，甚至社交媒体的提醒，都会激活旧的反应，使身体一下子回到过去。但这只是线索激活了你的记忆网路。</w:t>
       </w:r>
     </w:p>
     <w:p>
+      <w:pPr/>
       <w:r>
         <w:t>情绪反扑时，我们不应为之羞耻或恐惧，这反而可能导致小小的波动成为彻底失控。它其实就如同自然现象，正如下雨天我们会打伞，但不会因打伞而自责，当情绪波动大的时候，我们也应该远离刺激源，但不因情绪波动而羞耻。</w:t>
       </w:r>
     </w:p>
     <w:p>
+      <w:pPr/>
       <w:r>
         <w:t>撤离固定的情绪模式往往是由一个个微小的动作堆砌出来的。这种“小步撤退”可从三个方面着手。</w:t>
       </w:r>
     </w:p>
     <w:p>
+      <w:pPr/>
       <w:r>
         <w:t>第一是时间。为高刺激内容的时间设置范围，比如只在特定时间处理，睡前不看，不在工作间歇反复阅读。有时间界限，情绪的侵入就有其限制，不再能随时进入你的生活。</w:t>
       </w:r>
     </w:p>
     <w:p>
+      <w:pPr/>
       <w:r>
         <w:t>第二是空间。不要在床上处理最强烈的情绪。床要重新与睡眠挂钩，而不是与哭泣、刷屏、等消息挂钩。你可以坐到桌边看视频，走到客厅拟消息。空间的变化能够提醒大脑：你可以选择自己的行为。</w:t>
       </w:r>
     </w:p>
     <w:p>
+      <w:pPr/>
       <w:r>
         <w:t>第三是身份。不要为自己贴上“等待回应”、“受伤”或“嗑生嗑死”的标签。你同时是同事、朋友、儿女，也同时可以是喜欢跑步的人、喜欢读书的人。标签越少，身份越多，情绪越不容易占据你生活的全部空间。</w:t>
       </w:r>
     </w:p>
     <w:p>
+      <w:pPr/>
       <w:r>
         <w:t>小步撤离时同样会遭遇情绪反扑。重要的是在情绪波动时不要否定自己。你只要知道这是正常回路，并且继续向前。大脑学会新的习惯，就是通过不断地重复。</w:t>
       </w:r>
@@ -2086,654 +3812,203 @@
     <w:p>
       <w:pPr>
         <w:pStyle w:val="Heading1"/>
-        <w:pageBreakBefore/>
       </w:pPr>
       <w:r>
-        <w:t>附录三 官方检测报告原文</w:t>
-      </w:r>
-    </w:p>
-    <w:p>
-      <w:r>
-        <w:t>用户确认本报告由官方提供。报告用于理解具体反馈，不能外推为全部审核标准，也不能把报告例句自动归到当前新稿。以下保留报告原内容。</w:t>
-      </w:r>
-    </w:p>
-    <w:p>
+        <w:t>附录三 正反案例检测报告与判读</w:t>
+      </w:r>
+    </w:p>
+    <w:p>
+      <w:pPr/>
+      <w:r>
+        <w:t>本附录用于固定两篇样稿的角色。检测报告不是普遍算法说明，但在本指令内部，它们是为什么把白酒稿定为正面案例、把《越虐越上头》定为反面案例的重要依据。后续模型不得只看到两篇全文而忽略这层标注，也不得把反面稿误当成“参考文风”。</w:t>
+      </w:r>
+    </w:p>
+    <w:p>
+      <w:pPr>
+        <w:pStyle w:val="Heading2"/>
+      </w:pPr>
+      <w:r>
+        <w:t>A 正面案例检测报告：白酒稿</w:t>
+      </w:r>
+    </w:p>
+    <w:p>
+      <w:pPr/>
       <w:r>
         <w:t>AI 味检测报告</w:t>
       </w:r>
     </w:p>
     <w:p>
+      <w:pPr/>
+      <w:r>
+        <w:t>书籍名称：中国白酒四十年：名酒崛起与价格崩盘</w:t>
+      </w:r>
+    </w:p>
+    <w:p>
+      <w:pPr/>
+      <w:r>
+        <w:t>稿件字数：13447</w:t>
+      </w:r>
+    </w:p>
+    <w:p>
+      <w:pPr/>
+      <w:r>
+        <w:t>检测概览</w:t>
+      </w:r>
+    </w:p>
+    <w:p>
+      <w:pPr/>
+      <w:r>
+        <w:t>整体风险评分：0%  【低风险】</w:t>
+      </w:r>
+    </w:p>
+    <w:p>
+      <w:pPr/>
+      <w:r>
+        <w:t>句式套路化｜权重 25%｜评分 0｜低风险</w:t>
+      </w:r>
+    </w:p>
+    <w:p>
+      <w:pPr/>
+      <w:r>
+        <w:t>表达空泛｜权重 15%｜评分 0｜低风险</w:t>
+      </w:r>
+    </w:p>
+    <w:p>
+      <w:pPr/>
+      <w:r>
+        <w:t>句法臃肿｜权重 20%｜评分 0｜低风险</w:t>
+      </w:r>
+    </w:p>
+    <w:p>
+      <w:pPr/>
+      <w:r>
+        <w:t>节奏机械｜权重 25%｜评分 0｜低风险</w:t>
+      </w:r>
+    </w:p>
+    <w:p>
+      <w:pPr/>
+      <w:r>
+        <w:t>信息密度｜权重 15%｜评分 0｜低风险</w:t>
+      </w:r>
+    </w:p>
+    <w:p>
+      <w:pPr/>
+      <w:r>
+        <w:t>检测到 0 类共性问题，涉及约 0 处。</w:t>
+      </w:r>
+    </w:p>
+    <w:p>
+      <w:pPr/>
+      <w:r>
+        <w:t>判读：在本项目中，这份结果支持把白酒稿作为整篇正面风格基准。学习时关注它的总体组织和自然推进，不要反过来把其中某个单词解释成“安全词”。同样，也不要因为它被定为正面案例，就把其中的行业数字和判断直接当成其他稿件的事实来源。</w:t>
+      </w:r>
+    </w:p>
+    <w:p>
+      <w:pPr>
+        <w:pStyle w:val="Heading2"/>
+      </w:pPr>
+      <w:r>
+        <w:t>B 反面案例检测报告：《越虐越上头》</w:t>
+      </w:r>
+    </w:p>
+    <w:p>
+      <w:pPr/>
+      <w:r>
+        <w:t>AI 味检测报告</w:t>
+      </w:r>
+    </w:p>
+    <w:p>
+      <w:pPr/>
       <w:r>
         <w:t>书籍名称：越虐越上头：大脑为何迷恋痛感</w:t>
       </w:r>
     </w:p>
     <w:p>
+      <w:pPr/>
       <w:r>
         <w:t>稿件字数：14992</w:t>
       </w:r>
     </w:p>
     <w:p>
+      <w:pPr/>
       <w:r>
         <w:t>检测概览</w:t>
       </w:r>
     </w:p>
     <w:p>
+      <w:pPr/>
       <w:r>
         <w:t>整体风险评分：50%  【中风险】</w:t>
       </w:r>
     </w:p>
-    <w:tbl>
-      <w:tblPr>
-        <w:tblW w:type="auto" w:w="0"/>
-        <w:tblLayout w:type="fixed"/>
-        <w:tblLook w:firstColumn="1" w:firstRow="1" w:lastColumn="0" w:lastRow="0" w:noHBand="0" w:noVBand="1" w:val="04A0"/>
-      </w:tblPr>
-      <w:tblGrid>
-        <w:gridCol w:w="2498"/>
-        <w:gridCol w:w="2498"/>
-        <w:gridCol w:w="2498"/>
-        <w:gridCol w:w="2498"/>
-      </w:tblGrid>
-      <w:tr>
-        <w:trPr>
-          <w:tblHeader/>
-        </w:trPr>
-        <w:tc>
-          <w:tcPr>
-            <w:tcW w:type="dxa" w:w="2498"/>
-            <w:tcBorders>
-              <w:top w:val="single" w:sz="4" w:color="D9D9D9"/>
-              <w:left w:val="single" w:sz="4" w:color="D9D9D9"/>
-              <w:bottom w:val="single" w:sz="4" w:color="D9D9D9"/>
-              <w:right w:val="single" w:sz="4" w:color="D9D9D9"/>
-            </w:tcBorders>
-          </w:tcPr>
-          <w:p>
-            <w:pPr>
-              <w:spacing w:after="80"/>
-            </w:pPr>
-            <w:r>
-              <w:rPr>
-                <w:b/>
-                <w:sz w:val="20"/>
-              </w:rPr>
-              <w:t>维度</w:t>
-            </w:r>
-          </w:p>
-        </w:tc>
-        <w:tc>
-          <w:tcPr>
-            <w:tcW w:type="dxa" w:w="2498"/>
-            <w:tcBorders>
-              <w:top w:val="single" w:sz="4" w:color="D9D9D9"/>
-              <w:left w:val="single" w:sz="4" w:color="D9D9D9"/>
-              <w:bottom w:val="single" w:sz="4" w:color="D9D9D9"/>
-              <w:right w:val="single" w:sz="4" w:color="D9D9D9"/>
-            </w:tcBorders>
-          </w:tcPr>
-          <w:p>
-            <w:pPr>
-              <w:spacing w:after="80"/>
-            </w:pPr>
-            <w:r>
-              <w:rPr>
-                <w:b/>
-                <w:sz w:val="20"/>
-              </w:rPr>
-              <w:t>权重</w:t>
-            </w:r>
-          </w:p>
-        </w:tc>
-        <w:tc>
-          <w:tcPr>
-            <w:tcW w:type="dxa" w:w="2498"/>
-            <w:tcBorders>
-              <w:top w:val="single" w:sz="4" w:color="D9D9D9"/>
-              <w:left w:val="single" w:sz="4" w:color="D9D9D9"/>
-              <w:bottom w:val="single" w:sz="4" w:color="D9D9D9"/>
-              <w:right w:val="single" w:sz="4" w:color="D9D9D9"/>
-            </w:tcBorders>
-          </w:tcPr>
-          <w:p>
-            <w:pPr>
-              <w:spacing w:after="80"/>
-            </w:pPr>
-            <w:r>
-              <w:rPr>
-                <w:b/>
-                <w:sz w:val="20"/>
-              </w:rPr>
-              <w:t>评分</w:t>
-            </w:r>
-          </w:p>
-        </w:tc>
-        <w:tc>
-          <w:tcPr>
-            <w:tcW w:type="dxa" w:w="2498"/>
-            <w:tcBorders>
-              <w:top w:val="single" w:sz="4" w:color="D9D9D9"/>
-              <w:left w:val="single" w:sz="4" w:color="D9D9D9"/>
-              <w:bottom w:val="single" w:sz="4" w:color="D9D9D9"/>
-              <w:right w:val="single" w:sz="4" w:color="D9D9D9"/>
-            </w:tcBorders>
-          </w:tcPr>
-          <w:p>
-            <w:pPr>
-              <w:spacing w:after="80"/>
-            </w:pPr>
-            <w:r>
-              <w:rPr>
-                <w:b/>
-                <w:sz w:val="20"/>
-              </w:rPr>
-              <w:t>状态</w:t>
-            </w:r>
-          </w:p>
-        </w:tc>
-      </w:tr>
-      <w:tr>
-        <w:tc>
-          <w:tcPr>
-            <w:tcW w:type="dxa" w:w="2498"/>
-            <w:tcBorders>
-              <w:top w:val="single" w:sz="4" w:color="D9D9D9"/>
-              <w:left w:val="single" w:sz="4" w:color="D9D9D9"/>
-              <w:bottom w:val="single" w:sz="4" w:color="D9D9D9"/>
-              <w:right w:val="single" w:sz="4" w:color="D9D9D9"/>
-            </w:tcBorders>
-          </w:tcPr>
-          <w:p>
-            <w:pPr>
-              <w:spacing w:after="80"/>
-            </w:pPr>
-            <w:r>
-              <w:rPr>
-                <w:b w:val="0"/>
-                <w:sz w:val="20"/>
-              </w:rPr>
-              <w:t>句式套路化</w:t>
-            </w:r>
-          </w:p>
-        </w:tc>
-        <w:tc>
-          <w:tcPr>
-            <w:tcW w:type="dxa" w:w="2498"/>
-            <w:tcBorders>
-              <w:top w:val="single" w:sz="4" w:color="D9D9D9"/>
-              <w:left w:val="single" w:sz="4" w:color="D9D9D9"/>
-              <w:bottom w:val="single" w:sz="4" w:color="D9D9D9"/>
-              <w:right w:val="single" w:sz="4" w:color="D9D9D9"/>
-            </w:tcBorders>
-          </w:tcPr>
-          <w:p>
-            <w:pPr>
-              <w:spacing w:after="80"/>
-            </w:pPr>
-            <w:r>
-              <w:rPr>
-                <w:b w:val="0"/>
-                <w:sz w:val="20"/>
-              </w:rPr>
-              <w:t>25%</w:t>
-            </w:r>
-          </w:p>
-        </w:tc>
-        <w:tc>
-          <w:tcPr>
-            <w:tcW w:type="dxa" w:w="2498"/>
-            <w:tcBorders>
-              <w:top w:val="single" w:sz="4" w:color="D9D9D9"/>
-              <w:left w:val="single" w:sz="4" w:color="D9D9D9"/>
-              <w:bottom w:val="single" w:sz="4" w:color="D9D9D9"/>
-              <w:right w:val="single" w:sz="4" w:color="D9D9D9"/>
-            </w:tcBorders>
-          </w:tcPr>
-          <w:p>
-            <w:pPr>
-              <w:spacing w:after="80"/>
-            </w:pPr>
-            <w:r>
-              <w:rPr>
-                <w:b w:val="0"/>
-                <w:sz w:val="20"/>
-              </w:rPr>
-              <w:t>45</w:t>
-            </w:r>
-          </w:p>
-        </w:tc>
-        <w:tc>
-          <w:tcPr>
-            <w:tcW w:type="dxa" w:w="2498"/>
-            <w:tcBorders>
-              <w:top w:val="single" w:sz="4" w:color="D9D9D9"/>
-              <w:left w:val="single" w:sz="4" w:color="D9D9D9"/>
-              <w:bottom w:val="single" w:sz="4" w:color="D9D9D9"/>
-              <w:right w:val="single" w:sz="4" w:color="D9D9D9"/>
-            </w:tcBorders>
-          </w:tcPr>
-          <w:p>
-            <w:pPr>
-              <w:spacing w:after="80"/>
-            </w:pPr>
-            <w:r>
-              <w:rPr>
-                <w:b w:val="0"/>
-                <w:sz w:val="20"/>
-              </w:rPr>
-              <w:t>中风险</w:t>
-            </w:r>
-          </w:p>
-        </w:tc>
-      </w:tr>
-      <w:tr>
-        <w:tc>
-          <w:tcPr>
-            <w:tcW w:type="dxa" w:w="2498"/>
-            <w:tcBorders>
-              <w:top w:val="single" w:sz="4" w:color="D9D9D9"/>
-              <w:left w:val="single" w:sz="4" w:color="D9D9D9"/>
-              <w:bottom w:val="single" w:sz="4" w:color="D9D9D9"/>
-              <w:right w:val="single" w:sz="4" w:color="D9D9D9"/>
-            </w:tcBorders>
-          </w:tcPr>
-          <w:p>
-            <w:pPr>
-              <w:spacing w:after="80"/>
-            </w:pPr>
-            <w:r>
-              <w:rPr>
-                <w:b w:val="0"/>
-                <w:sz w:val="20"/>
-              </w:rPr>
-              <w:t>表达空泛</w:t>
-            </w:r>
-          </w:p>
-        </w:tc>
-        <w:tc>
-          <w:tcPr>
-            <w:tcW w:type="dxa" w:w="2498"/>
-            <w:tcBorders>
-              <w:top w:val="single" w:sz="4" w:color="D9D9D9"/>
-              <w:left w:val="single" w:sz="4" w:color="D9D9D9"/>
-              <w:bottom w:val="single" w:sz="4" w:color="D9D9D9"/>
-              <w:right w:val="single" w:sz="4" w:color="D9D9D9"/>
-            </w:tcBorders>
-          </w:tcPr>
-          <w:p>
-            <w:pPr>
-              <w:spacing w:after="80"/>
-            </w:pPr>
-            <w:r>
-              <w:rPr>
-                <w:b w:val="0"/>
-                <w:sz w:val="20"/>
-              </w:rPr>
-              <w:t>15%</w:t>
-            </w:r>
-          </w:p>
-        </w:tc>
-        <w:tc>
-          <w:tcPr>
-            <w:tcW w:type="dxa" w:w="2498"/>
-            <w:tcBorders>
-              <w:top w:val="single" w:sz="4" w:color="D9D9D9"/>
-              <w:left w:val="single" w:sz="4" w:color="D9D9D9"/>
-              <w:bottom w:val="single" w:sz="4" w:color="D9D9D9"/>
-              <w:right w:val="single" w:sz="4" w:color="D9D9D9"/>
-            </w:tcBorders>
-          </w:tcPr>
-          <w:p>
-            <w:pPr>
-              <w:spacing w:after="80"/>
-            </w:pPr>
-            <w:r>
-              <w:rPr>
-                <w:b w:val="0"/>
-                <w:sz w:val="20"/>
-              </w:rPr>
-              <w:t>0</w:t>
-            </w:r>
-          </w:p>
-        </w:tc>
-        <w:tc>
-          <w:tcPr>
-            <w:tcW w:type="dxa" w:w="2498"/>
-            <w:tcBorders>
-              <w:top w:val="single" w:sz="4" w:color="D9D9D9"/>
-              <w:left w:val="single" w:sz="4" w:color="D9D9D9"/>
-              <w:bottom w:val="single" w:sz="4" w:color="D9D9D9"/>
-              <w:right w:val="single" w:sz="4" w:color="D9D9D9"/>
-            </w:tcBorders>
-          </w:tcPr>
-          <w:p>
-            <w:pPr>
-              <w:spacing w:after="80"/>
-            </w:pPr>
-            <w:r>
-              <w:rPr>
-                <w:b w:val="0"/>
-                <w:sz w:val="20"/>
-              </w:rPr>
-              <w:t>低风险</w:t>
-            </w:r>
-          </w:p>
-        </w:tc>
-      </w:tr>
-      <w:tr>
-        <w:tc>
-          <w:tcPr>
-            <w:tcW w:type="dxa" w:w="2498"/>
-            <w:tcBorders>
-              <w:top w:val="single" w:sz="4" w:color="D9D9D9"/>
-              <w:left w:val="single" w:sz="4" w:color="D9D9D9"/>
-              <w:bottom w:val="single" w:sz="4" w:color="D9D9D9"/>
-              <w:right w:val="single" w:sz="4" w:color="D9D9D9"/>
-            </w:tcBorders>
-          </w:tcPr>
-          <w:p>
-            <w:pPr>
-              <w:spacing w:after="80"/>
-            </w:pPr>
-            <w:r>
-              <w:rPr>
-                <w:b w:val="0"/>
-                <w:sz w:val="20"/>
-              </w:rPr>
-              <w:t>句法臃肿</w:t>
-            </w:r>
-          </w:p>
-        </w:tc>
-        <w:tc>
-          <w:tcPr>
-            <w:tcW w:type="dxa" w:w="2498"/>
-            <w:tcBorders>
-              <w:top w:val="single" w:sz="4" w:color="D9D9D9"/>
-              <w:left w:val="single" w:sz="4" w:color="D9D9D9"/>
-              <w:bottom w:val="single" w:sz="4" w:color="D9D9D9"/>
-              <w:right w:val="single" w:sz="4" w:color="D9D9D9"/>
-            </w:tcBorders>
-          </w:tcPr>
-          <w:p>
-            <w:pPr>
-              <w:spacing w:after="80"/>
-            </w:pPr>
-            <w:r>
-              <w:rPr>
-                <w:b w:val="0"/>
-                <w:sz w:val="20"/>
-              </w:rPr>
-              <w:t>20%</w:t>
-            </w:r>
-          </w:p>
-        </w:tc>
-        <w:tc>
-          <w:tcPr>
-            <w:tcW w:type="dxa" w:w="2498"/>
-            <w:tcBorders>
-              <w:top w:val="single" w:sz="4" w:color="D9D9D9"/>
-              <w:left w:val="single" w:sz="4" w:color="D9D9D9"/>
-              <w:bottom w:val="single" w:sz="4" w:color="D9D9D9"/>
-              <w:right w:val="single" w:sz="4" w:color="D9D9D9"/>
-            </w:tcBorders>
-          </w:tcPr>
-          <w:p>
-            <w:pPr>
-              <w:spacing w:after="80"/>
-            </w:pPr>
-            <w:r>
-              <w:rPr>
-                <w:b w:val="0"/>
-                <w:sz w:val="20"/>
-              </w:rPr>
-              <w:t>0</w:t>
-            </w:r>
-          </w:p>
-        </w:tc>
-        <w:tc>
-          <w:tcPr>
-            <w:tcW w:type="dxa" w:w="2498"/>
-            <w:tcBorders>
-              <w:top w:val="single" w:sz="4" w:color="D9D9D9"/>
-              <w:left w:val="single" w:sz="4" w:color="D9D9D9"/>
-              <w:bottom w:val="single" w:sz="4" w:color="D9D9D9"/>
-              <w:right w:val="single" w:sz="4" w:color="D9D9D9"/>
-            </w:tcBorders>
-          </w:tcPr>
-          <w:p>
-            <w:pPr>
-              <w:spacing w:after="80"/>
-            </w:pPr>
-            <w:r>
-              <w:rPr>
-                <w:b w:val="0"/>
-                <w:sz w:val="20"/>
-              </w:rPr>
-              <w:t>低风险</w:t>
-            </w:r>
-          </w:p>
-        </w:tc>
-      </w:tr>
-      <w:tr>
-        <w:tc>
-          <w:tcPr>
-            <w:tcW w:type="dxa" w:w="2498"/>
-            <w:tcBorders>
-              <w:top w:val="single" w:sz="4" w:color="D9D9D9"/>
-              <w:left w:val="single" w:sz="4" w:color="D9D9D9"/>
-              <w:bottom w:val="single" w:sz="4" w:color="D9D9D9"/>
-              <w:right w:val="single" w:sz="4" w:color="D9D9D9"/>
-            </w:tcBorders>
-          </w:tcPr>
-          <w:p>
-            <w:pPr>
-              <w:spacing w:after="80"/>
-            </w:pPr>
-            <w:r>
-              <w:rPr>
-                <w:b w:val="0"/>
-                <w:sz w:val="20"/>
-              </w:rPr>
-              <w:t>节奏机械</w:t>
-            </w:r>
-          </w:p>
-        </w:tc>
-        <w:tc>
-          <w:tcPr>
-            <w:tcW w:type="dxa" w:w="2498"/>
-            <w:tcBorders>
-              <w:top w:val="single" w:sz="4" w:color="D9D9D9"/>
-              <w:left w:val="single" w:sz="4" w:color="D9D9D9"/>
-              <w:bottom w:val="single" w:sz="4" w:color="D9D9D9"/>
-              <w:right w:val="single" w:sz="4" w:color="D9D9D9"/>
-            </w:tcBorders>
-          </w:tcPr>
-          <w:p>
-            <w:pPr>
-              <w:spacing w:after="80"/>
-            </w:pPr>
-            <w:r>
-              <w:rPr>
-                <w:b w:val="0"/>
-                <w:sz w:val="20"/>
-              </w:rPr>
-              <w:t>25%</w:t>
-            </w:r>
-          </w:p>
-        </w:tc>
-        <w:tc>
-          <w:tcPr>
-            <w:tcW w:type="dxa" w:w="2498"/>
-            <w:tcBorders>
-              <w:top w:val="single" w:sz="4" w:color="D9D9D9"/>
-              <w:left w:val="single" w:sz="4" w:color="D9D9D9"/>
-              <w:bottom w:val="single" w:sz="4" w:color="D9D9D9"/>
-              <w:right w:val="single" w:sz="4" w:color="D9D9D9"/>
-            </w:tcBorders>
-          </w:tcPr>
-          <w:p>
-            <w:pPr>
-              <w:spacing w:after="80"/>
-            </w:pPr>
-            <w:r>
-              <w:rPr>
-                <w:b w:val="0"/>
-                <w:sz w:val="20"/>
-              </w:rPr>
-              <w:t>0</w:t>
-            </w:r>
-          </w:p>
-        </w:tc>
-        <w:tc>
-          <w:tcPr>
-            <w:tcW w:type="dxa" w:w="2498"/>
-            <w:tcBorders>
-              <w:top w:val="single" w:sz="4" w:color="D9D9D9"/>
-              <w:left w:val="single" w:sz="4" w:color="D9D9D9"/>
-              <w:bottom w:val="single" w:sz="4" w:color="D9D9D9"/>
-              <w:right w:val="single" w:sz="4" w:color="D9D9D9"/>
-            </w:tcBorders>
-          </w:tcPr>
-          <w:p>
-            <w:pPr>
-              <w:spacing w:after="80"/>
-            </w:pPr>
-            <w:r>
-              <w:rPr>
-                <w:b w:val="0"/>
-                <w:sz w:val="20"/>
-              </w:rPr>
-              <w:t>低风险</w:t>
-            </w:r>
-          </w:p>
-        </w:tc>
-      </w:tr>
-      <w:tr>
-        <w:tc>
-          <w:tcPr>
-            <w:tcW w:type="dxa" w:w="2498"/>
-            <w:tcBorders>
-              <w:top w:val="single" w:sz="4" w:color="D9D9D9"/>
-              <w:left w:val="single" w:sz="4" w:color="D9D9D9"/>
-              <w:bottom w:val="single" w:sz="4" w:color="D9D9D9"/>
-              <w:right w:val="single" w:sz="4" w:color="D9D9D9"/>
-            </w:tcBorders>
-          </w:tcPr>
-          <w:p>
-            <w:pPr>
-              <w:spacing w:after="80"/>
-            </w:pPr>
-            <w:r>
-              <w:rPr>
-                <w:b w:val="0"/>
-                <w:sz w:val="20"/>
-              </w:rPr>
-              <w:t>信息密度</w:t>
-            </w:r>
-          </w:p>
-        </w:tc>
-        <w:tc>
-          <w:tcPr>
-            <w:tcW w:type="dxa" w:w="2498"/>
-            <w:tcBorders>
-              <w:top w:val="single" w:sz="4" w:color="D9D9D9"/>
-              <w:left w:val="single" w:sz="4" w:color="D9D9D9"/>
-              <w:bottom w:val="single" w:sz="4" w:color="D9D9D9"/>
-              <w:right w:val="single" w:sz="4" w:color="D9D9D9"/>
-            </w:tcBorders>
-          </w:tcPr>
-          <w:p>
-            <w:pPr>
-              <w:spacing w:after="80"/>
-            </w:pPr>
-            <w:r>
-              <w:rPr>
-                <w:b w:val="0"/>
-                <w:sz w:val="20"/>
-              </w:rPr>
-              <w:t>15%</w:t>
-            </w:r>
-          </w:p>
-        </w:tc>
-        <w:tc>
-          <w:tcPr>
-            <w:tcW w:type="dxa" w:w="2498"/>
-            <w:tcBorders>
-              <w:top w:val="single" w:sz="4" w:color="D9D9D9"/>
-              <w:left w:val="single" w:sz="4" w:color="D9D9D9"/>
-              <w:bottom w:val="single" w:sz="4" w:color="D9D9D9"/>
-              <w:right w:val="single" w:sz="4" w:color="D9D9D9"/>
-            </w:tcBorders>
-          </w:tcPr>
-          <w:p>
-            <w:pPr>
-              <w:spacing w:after="80"/>
-            </w:pPr>
-            <w:r>
-              <w:rPr>
-                <w:b w:val="0"/>
-                <w:sz w:val="20"/>
-              </w:rPr>
-              <w:t>25</w:t>
-            </w:r>
-          </w:p>
-        </w:tc>
-        <w:tc>
-          <w:tcPr>
-            <w:tcW w:type="dxa" w:w="2498"/>
-            <w:tcBorders>
-              <w:top w:val="single" w:sz="4" w:color="D9D9D9"/>
-              <w:left w:val="single" w:sz="4" w:color="D9D9D9"/>
-              <w:bottom w:val="single" w:sz="4" w:color="D9D9D9"/>
-              <w:right w:val="single" w:sz="4" w:color="D9D9D9"/>
-            </w:tcBorders>
-          </w:tcPr>
-          <w:p>
-            <w:pPr>
-              <w:spacing w:after="80"/>
-            </w:pPr>
-            <w:r>
-              <w:rPr>
-                <w:b w:val="0"/>
-                <w:sz w:val="20"/>
-              </w:rPr>
-              <w:t>低风险</w:t>
-            </w:r>
-          </w:p>
-        </w:tc>
-      </w:tr>
-    </w:tbl>
-    <w:p/>
-    <w:p>
-      <w:r>
-        <w:t>检测到 4 类共性问题，涉及约 17 处</w:t>
-      </w:r>
-    </w:p>
-    <w:p>
+    <w:p>
+      <w:pPr/>
+      <w:r>
+        <w:t>句式套路化｜权重 25%｜评分 45｜中风险</w:t>
+      </w:r>
+    </w:p>
+    <w:p>
+      <w:pPr/>
+      <w:r>
+        <w:t>表达空泛｜权重 15%｜评分 0｜低风险</w:t>
+      </w:r>
+    </w:p>
+    <w:p>
+      <w:pPr/>
+      <w:r>
+        <w:t>句法臃肿｜权重 20%｜评分 0｜低风险</w:t>
+      </w:r>
+    </w:p>
+    <w:p>
+      <w:pPr/>
+      <w:r>
+        <w:t>节奏机械｜权重 25%｜评分 0｜低风险</w:t>
+      </w:r>
+    </w:p>
+    <w:p>
+      <w:pPr/>
+      <w:r>
+        <w:t>信息密度｜权重 15%｜评分 25｜低风险</w:t>
+      </w:r>
+    </w:p>
+    <w:p>
+      <w:pPr/>
+      <w:r>
+        <w:t>检测到 4 类共性问题，涉及约 17 处。</w:t>
+      </w:r>
+    </w:p>
+    <w:p>
+      <w:pPr/>
       <w:r>
         <w:t>共性问题分析</w:t>
       </w:r>
     </w:p>
     <w:p>
+      <w:pPr/>
       <w:r>
         <w:t>1. 对比句「不是…而是…」  【高 70】</w:t>
       </w:r>
     </w:p>
     <w:p>
+      <w:pPr/>
       <w:r>
         <w:t xml:space="preserve">   全书约 10 处  |  维度：句式套路化</w:t>
       </w:r>
     </w:p>
     <w:p>
+      <w:pPr/>
       <w:r>
         <w:t xml:space="preserve">   说明：该段多次使用高危对比句式「不是……而是……」，且部分对比内容空洞（如「不是全然冷淡，否则……」「不是每一次都能得到奖励」），属于AI标志性句式滥用。</w:t>
       </w:r>
     </w:p>
     <w:p>
+      <w:pPr/>
       <w:r>
         <w:t xml:space="preserve">   示例：</w:t>
       </w:r>
     </w:p>
     <w:p>
+      <w:pPr/>
       <w:r>
         <w:t xml:space="preserve">     · …那些让人欲罢不能、反复拉扯的关系，有一个共同的特点：时常摇摆不定，其中偶有些许甜蜜。</w:t>
         <w:br/>
@@ -2743,6 +4018,7 @@
       </w:r>
     </w:p>
     <w:p>
+      <w:pPr/>
       <w:r>
         <w:t xml:space="preserve">     · …对方不是全然冷淡，否则，人在完全得不到回应的情况下很容易离开。折磨人的恰恰在于你打算放弃时，他偏偏给你一点希望；你决定删掉她时，她又突然发来关心；你们吵得筋疲力尽时，得到了一个深情的拥抱。所以，你的大脑牢牢地记住了这一点甜蜜，并为此在煎熬时依旧等待下一颗糖。</w:t>
         <w:br/>
@@ -2752,6 +4028,7 @@
       </w:r>
     </w:p>
     <w:p>
+      <w:pPr/>
       <w:r>
         <w:t xml:space="preserve">     · …这种心理。编剧把真相藏在迷雾里，把告白一拖再拖，把重逢的关键时刻放到下一集。观众明知这是套路，却还是被牵着鼻子走。因为大脑天生喜欢“闭合”，越接近答案，你就越停不下来。本来打算睡觉了，却总觉得“再看一集就有结果了”，结果新的悬念在下一集接踵而至。</w:t>
         <w:br/>
@@ -2761,6 +4038,7 @@
       </w:r>
     </w:p>
     <w:p>
+      <w:pPr/>
       <w:r>
         <w:t xml:space="preserve">     · …会被别人认可，甚至连现实中不好说出口的细腻感受，同好圈都有相对应的语言。你觉得那一幕让人酸涩，别人也感同身受；你听出某句话有双关含义，别人也心照不宣；你为角色伤心，有几十个人陪你一起流泪，这种感受会放大并确认你的情绪体验。</w:t>
         <w:br/>
@@ -2770,6 +4048,7 @@
       </w:r>
     </w:p>
     <w:p>
+      <w:pPr/>
       <w:r>
         <w:t xml:space="preserve">     · …什么是“我的真实感受”，什么是“大家希望我表现出来的感受”。有时你的内心并不太痛苦，但连续刷了几十条虐心的剪辑视频，情绪却被拉到了低处。</w:t>
         <w:br/>
@@ -2779,6 +4058,7 @@
       </w:r>
     </w:p>
     <w:p>
+      <w:pPr/>
       <w:r>
         <w:t xml:space="preserve">     · …如果不想再陷入这种感觉，可以给自己创造一个可执行的“关闭动作”，并不一定需要对方配合。因为有些人永远不会给你解释，有些道歉注定等不到，有些关系就是会一直不明不白。你可以试着写一封永远不寄出的信，列出那些得不到答案的问题；或者为这段关系设定一个停止追问的终止点；甚至可以用一句话帮大脑完成归档，比如：“没有清楚的回应，这本身就是一种回应。”这种动作让混乱的情绪有了一个容器。情绪虽然还会涌动，但至少不会再次无边际地扩散。</w:t>
         <w:br/>
@@ -2786,6 +4066,7 @@
       </w:r>
     </w:p>
     <w:p>
+      <w:pPr/>
       <w:r>
         <w:t xml:space="preserve">     · …“情绪命名”是一种简单却十分有效的调节手段。就是用具体的词说出当下的感受。</w:t>
         <w:br/>
@@ -2795,6 +4076,7 @@
       </w:r>
     </w:p>
     <w:p>
+      <w:pPr/>
       <w:r>
         <w:t xml:space="preserve">     · …“情绪命名”是一种简单却十分有效的调节手段。就是用具体的词说出当下的感受。</w:t>
         <w:br/>
@@ -2804,6 +4086,7 @@
       </w:r>
     </w:p>
     <w:p>
+      <w:pPr/>
       <w:r>
         <w:t xml:space="preserve">     · …“情绪命名”是一种简单却十分有效的调节手段。就是用具体的词说出当下的感受。</w:t>
         <w:br/>
@@ -2813,31 +4096,37 @@
       </w:r>
     </w:p>
     <w:p>
+      <w:pPr/>
       <w:r>
         <w:t xml:space="preserve">     · 不是假的，是真的。</w:t>
       </w:r>
     </w:p>
     <w:p>
+      <w:pPr/>
       <w:r>
         <w:t>2. 信息密度低（车轱辘话）  【中 40】</w:t>
       </w:r>
     </w:p>
     <w:p>
+      <w:pPr/>
       <w:r>
         <w:t xml:space="preserve">   全书约 4 处  |  维度：信息密度</w:t>
       </w:r>
     </w:p>
     <w:p>
+      <w:pPr/>
       <w:r>
         <w:t xml:space="preserve">   说明：多处出现同一观点原地打转，如「间歇性回报」部分反复解释「忽冷忽热让人上瘾」；「记忆会加戏」部分反复强调「记忆会被重新编辑」。缺乏新信息推进。</w:t>
       </w:r>
     </w:p>
     <w:p>
+      <w:pPr/>
       <w:r>
         <w:t xml:space="preserve">   示例：</w:t>
       </w:r>
     </w:p>
     <w:p>
+      <w:pPr/>
       <w:r>
         <w:t xml:space="preserve">     · …这个机制在心理学中称为“间歇性强化”：你不是每一次都能得到奖励，奖励只是偶尔出现。</w:t>
         <w:br/>
@@ -2847,6 +4136,7 @@
       </w:r>
     </w:p>
     <w:p>
+      <w:pPr/>
       <w:r>
         <w:t xml:space="preserve">     · …一个平时冷淡的人突然说一句“我想你”，会瞬间点燃你的整个情绪系统。你记得自己曾经因为等待和被忽略如何煎熬，但情绪确实会在这一刻上头。长此以往，这会带来一种根深蒂固的心理暗示：疼痛之后必定有补偿。只要补偿没有到来，你的注意力就很难彻底撤离。</w:t>
         <w:br/>
@@ -2856,6 +4146,7 @@
       </w:r>
     </w:p>
     <w:p>
+      <w:pPr/>
       <w:r>
         <w:t xml:space="preserve">     · …记忆会加戏</w:t>
         <w:br/>
@@ -2864,6 +4155,7 @@
       </w:r>
     </w:p>
     <w:p>
+      <w:pPr/>
       <w:r>
         <w:t xml:space="preserve">     · …行动则是有效调动肌肉的方式。情绪上头时，出门散步十分钟，整理一下凌乱的桌面，洗个热水澡或做做拉伸，都能让情绪能量获得一个出口。事实上，大部分情况下，人越是僵住不动，情绪就越容易堆积。</w:t>
         <w:br/>
@@ -2873,58 +4165,75 @@
       </w:r>
     </w:p>
     <w:p>
+      <w:pPr/>
       <w:r>
         <w:t>3. 短句碎片收尾  【中 40】</w:t>
       </w:r>
     </w:p>
     <w:p>
+      <w:pPr/>
       <w:r>
         <w:t xml:space="preserve">   全书约 1 处  |  维度：节奏机械</w:t>
       </w:r>
     </w:p>
     <w:p>
+      <w:pPr/>
       <w:r>
         <w:t xml:space="preserve">   说明：长句末尾跟一个2-6字的短句做强调收尾，节奏机械，如「不是假的，是真的。」，全书反复出现即为AI味。</w:t>
       </w:r>
     </w:p>
     <w:p>
+      <w:pPr/>
       <w:r>
         <w:t xml:space="preserve">   示例：</w:t>
       </w:r>
     </w:p>
     <w:p>
+      <w:pPr/>
       <w:r>
         <w:t xml:space="preserve">     · 不是假的，是真的。</w:t>
       </w:r>
     </w:p>
     <w:p>
+      <w:pPr/>
       <w:r>
         <w:t>4. 小标题公式「核心是」  【中 30】</w:t>
       </w:r>
     </w:p>
     <w:p>
+      <w:pPr/>
       <w:r>
         <w:t xml:space="preserve">   全书约 2 处  |  维度：句式套路化</w:t>
       </w:r>
     </w:p>
     <w:p>
+      <w:pPr/>
       <w:r>
         <w:t xml:space="preserve">   说明：出现填充性短语「核心是」，属于AI味小标题公式。</w:t>
       </w:r>
     </w:p>
     <w:p>
+      <w:pPr/>
       <w:r>
         <w:t xml:space="preserve">   示例：</w:t>
       </w:r>
     </w:p>
     <w:p>
+      <w:pPr/>
       <w:r>
         <w:t xml:space="preserve">     · 核心是：——</w:t>
       </w:r>
     </w:p>
     <w:p>
+      <w:pPr/>
       <w:r>
         <w:t xml:space="preserve">     · 核心是</w:t>
+      </w:r>
+    </w:p>
+    <w:p>
+      <w:pPr/>
+      <w:r>
+        <w:t>判读：这份报告与反面稿全文共同使用。不要把问题理解成“出现一次某词就违规”，而要看它们如何在全文中重复、对称、轮换并造成信息停滞。新稿应主动避开这种整体模板感。</w:t>
       </w:r>
     </w:p>
     <w:p>
@@ -2938,6 +4247,12 @@
     <w:p>
       <w:pPr/>
       <w:r>
+        <w:t>使用本附录时，先记住附录二的正反样稿关系：白酒稿是整篇正面基准，《越虐越上头》是整篇反面基准。下面的单句与局部范例只能解释具体编辑动作，不能推翻这两个整篇锚点。遇到规则冲突时，优先判断哪种写法更接近白酒正面样稿的“具体信息持续推进”，并远离《越虐越上头》反面样稿的“套路句反复 + 同义解释打转 + 建议模板化”。</w:t>
+      </w:r>
+    </w:p>
+    <w:p>
+      <w:pPr/>
+      <w:r>
         <w:t>本附录综合《AI 写作降 AI 率·人工率提升指令词》与《长篇中文写作指令与对照范例》的共同结论，并用后者的反例校正前者中过度依赖检测器的做法。示例用于学习编辑动作，不是可复制素材；检测分数属于当时整段或全文，不是某一句的独立因果证明。</w:t>
       </w:r>
     </w:p>
@@ -3394,7 +4709,7 @@
     <w:p>
       <w:pPr/>
       <w:r>
-        <w:t>白酒库存示例中，消费者观望、门店卖得慢、进货减少、厂家发货变化之间存在连续关系。正式写作应说明销售和回款，不必用“割肉”“行业洗牌”先行定性。</w:t>
+        <w:t>白酒正面样稿的库存段值得重点学习：它把消费者观望、终端店怕压货、经销商现金流和厂家发货放在同一条链上，读者能看见压力怎样从销售端一路传回渠道。这里真正可迁移的是“多方参与者 + 连续因果 + 具体业务动作”的组织方式，而不是去复制“割经销商的肉”等原句。</w:t>
       </w:r>
     </w:p>
     <w:p>

</xml_diff>